<commit_message>
docs: streamline before-after to concise bullet points and add standalone section for promo & faq innovations
</commit_message>
<xml_diff>
--- a/Laporan_Information_Search_Booking_KAI.docx
+++ b/Laporan_Information_Search_Booking_KAI.docx
@@ -4,7 +4,7 @@
   <w:body>
     <w:p>
       <w:pPr>
-        <w:spacing w:after="100" w:before="0"/>
+        <w:spacing w:after="80" w:before="0"/>
         <w:jc w:val="center"/>
       </w:pPr>
       <w:r>
@@ -13,15 +13,15 @@
           <w:b/>
           <w:bCs/>
           <w:color w:val="003C71"/>
-          <w:sz w:val="32"/>
-          <w:szCs w:val="32"/>
+          <w:sz w:val="30"/>
+          <w:szCs w:val="30"/>
         </w:rPr>
         <w:t xml:space="preserve">LAPORAN TUGAS INTERAKSI MANUSIA DAN KOMPUTER (IMK)</w:t>
       </w:r>
     </w:p>
     <w:p>
       <w:pPr>
-        <w:spacing w:after="80" w:before="0"/>
+        <w:spacing w:after="60" w:before="0"/>
         <w:jc w:val="center"/>
       </w:pPr>
       <w:r>
@@ -30,15 +30,15 @@
           <w:b/>
           <w:bCs/>
           <w:color w:val="F58220"/>
-          <w:sz w:val="26"/>
-          <w:szCs w:val="26"/>
+          <w:sz w:val="25"/>
+          <w:szCs w:val="25"/>
         </w:rPr>
         <w:t xml:space="preserve">ANALISIS DAN REDESAIN FITUR INFORMATION SEARCH</w:t>
       </w:r>
     </w:p>
     <w:p>
       <w:pPr>
-        <w:spacing w:after="300" w:before="0"/>
+        <w:spacing w:after="260" w:before="0"/>
         <w:jc w:val="center"/>
       </w:pPr>
       <w:r>
@@ -46,8 +46,8 @@
           <w:rFonts w:ascii="Times New Roman" w:cs="Times New Roman" w:eastAsia="Times New Roman" w:hAnsi="Times New Roman"/>
           <w:i/>
           <w:iCs/>
-          <w:sz w:val="22"/>
-          <w:szCs w:val="22"/>
+          <w:sz w:val="21"/>
+          <w:szCs w:val="21"/>
         </w:rPr>
         <w:t xml:space="preserve">Studi Kasus: Sistem Reservasi Tiket Kereta Api Indonesia (Booking KAI)</w:t>
       </w:r>
@@ -72,10 +72,10 @@
           <w:tcPr>
             <w:shd w:fill="F3F4F6" w:val="clear"/>
             <w:tcMar>
-              <w:top w:type="dxa" w:w="120"/>
-              <w:left w:type="dxa" w:w="160"/>
-              <w:bottom w:type="dxa" w:w="120"/>
-              <w:right w:type="dxa" w:w="160"/>
+              <w:top w:type="dxa" w:w="100"/>
+              <w:left w:type="dxa" w:w="140"/>
+              <w:bottom w:type="dxa" w:w="100"/>
+              <w:right w:type="dxa" w:w="140"/>
             </w:tcMar>
           </w:tcPr>
           <w:p>
@@ -119,7 +119,7 @@
     </w:tbl>
     <w:p>
       <w:pPr>
-        <w:spacing w:after="100" w:before="200"/>
+        <w:spacing w:after="80" w:before="160"/>
       </w:pPr>
     </w:p>
     <w:p>
@@ -133,155 +133,155 @@
           <w:b/>
           <w:bCs/>
           <w:color w:val="003C71"/>
-          <w:sz w:val="28"/>
-          <w:szCs w:val="28"/>
+          <w:sz w:val="26"/>
+          <w:szCs w:val="26"/>
         </w:rPr>
         <w:t xml:space="preserve">1. IDENTIFIKASI FITUR</w:t>
       </w:r>
     </w:p>
     <w:p>
       <w:pPr>
-        <w:spacing w:after="80" w:before="60" w:line="276"/>
+        <w:spacing w:after="70" w:before="50" w:line="260"/>
       </w:pPr>
       <w:r>
         <w:rPr>
           <w:rFonts w:ascii="Times New Roman" w:cs="Times New Roman" w:eastAsia="Times New Roman" w:hAnsi="Times New Roman"/>
           <w:b/>
           <w:bCs/>
-          <w:sz w:val="22"/>
-          <w:szCs w:val="22"/>
+          <w:sz w:val="21"/>
+          <w:szCs w:val="21"/>
         </w:rPr>
         <w:t xml:space="preserve">1.1. Nama Aplikasi / Website</w:t>
       </w:r>
     </w:p>
     <w:p>
       <w:pPr>
-        <w:spacing w:after="80" w:before="60" w:line="276"/>
-      </w:pPr>
-      <w:r>
-        <w:rPr>
-          <w:rFonts w:ascii="Times New Roman" w:cs="Times New Roman" w:eastAsia="Times New Roman" w:hAnsi="Times New Roman"/>
-          <w:sz w:val="22"/>
-          <w:szCs w:val="22"/>
-        </w:rPr>
-        <w:t xml:space="preserve">Website Pemesanan Tiket Booking KAI (Redesain dari kanal digital resmi PT Kereta Api Indonesia, booking.kai.id). Prototipe interaktif dibangun menggunakan kerangka kerja Next.js dan Tailwind CSS dengan identitas visual khas KAI (Navy #003C71 dan Oranye #F58220).</w:t>
-      </w:r>
-    </w:p>
-    <w:p>
-      <w:pPr>
-        <w:spacing w:after="80" w:before="60" w:line="276"/>
+        <w:spacing w:after="70" w:before="50" w:line="260"/>
+      </w:pPr>
+      <w:r>
+        <w:rPr>
+          <w:rFonts w:ascii="Times New Roman" w:cs="Times New Roman" w:eastAsia="Times New Roman" w:hAnsi="Times New Roman"/>
+          <w:sz w:val="21"/>
+          <w:szCs w:val="21"/>
+        </w:rPr>
+        <w:t xml:space="preserve">Website Pemesanan Tiket Booking KAI (Redesain dari portal resmi booking.kai.id). Prototipe interaktif dibangun menggunakan kerangka kerja Next.js dan Tailwind CSS dengan tema visual khas KAI (Navy #003C71 dan Oranye #F58220).</w:t>
+      </w:r>
+    </w:p>
+    <w:p>
+      <w:pPr>
+        <w:spacing w:after="70" w:before="50" w:line="260"/>
       </w:pPr>
       <w:r>
         <w:rPr>
           <w:rFonts w:ascii="Times New Roman" w:cs="Times New Roman" w:eastAsia="Times New Roman" w:hAnsi="Times New Roman"/>
           <w:b/>
           <w:bCs/>
-          <w:sz w:val="22"/>
-          <w:szCs w:val="22"/>
+          <w:sz w:val="21"/>
+          <w:szCs w:val="21"/>
         </w:rPr>
         <w:t xml:space="preserve">1.2. Fitur yang Dianalisis</w:t>
       </w:r>
     </w:p>
     <w:p>
       <w:pPr>
-        <w:spacing w:after="80" w:before="60" w:line="276"/>
-      </w:pPr>
-      <w:r>
-        <w:rPr>
-          <w:rFonts w:ascii="Times New Roman" w:cs="Times New Roman" w:eastAsia="Times New Roman" w:hAnsi="Times New Roman"/>
-          <w:sz w:val="22"/>
-          <w:szCs w:val="22"/>
-        </w:rPr>
-        <w:t xml:space="preserve">Sistem Terpadu Penemuan Informasi (Integrated Information Search System), yang mencakup: (1) Pencarian Jadwal Tiket Kereta Api terstruktur, (2) Smart Suggestion &amp; Autocomplete Stasiun, (3) Navigasi Spasial Rute Kereta Api via Peta Interaktif Pulau Jawa, (4) Panel Penyaringan (Filter) Multi-Kategori dan Pengurutan (Sorting) Dinamis, (5) Pencarian Promo &amp; Penawaran Khusus, serta (6) Pencarian Dokumen Pengetahuan &amp; Bantuan Perjalanan (FAQ Knowledge Base).</w:t>
-      </w:r>
-    </w:p>
-    <w:p>
-      <w:pPr>
-        <w:spacing w:after="80" w:before="60" w:line="276"/>
+        <w:spacing w:after="70" w:before="50" w:line="260"/>
+      </w:pPr>
+      <w:r>
+        <w:rPr>
+          <w:rFonts w:ascii="Times New Roman" w:cs="Times New Roman" w:eastAsia="Times New Roman" w:hAnsi="Times New Roman"/>
+          <w:sz w:val="21"/>
+          <w:szCs w:val="21"/>
+        </w:rPr>
+        <w:t xml:space="preserve">Sistem Terpadu Penemuan Informasi (Information Search System), meliputi: (1) Form Pencarian Jadwal Tiket Kereta Api, (2) Smart Suggestion &amp; Autocomplete Stasiun, (3) Navigasi Spasial Rute via Peta Interaktif Pulau Jawa, (4) Toolbar Filter Dropdown Multi-Kategori dan Pengurutan (Sorting) Dinamis, (5) Pusat Promo &amp; Voucher Terintegrasi, serta (6) Knowledge Search / FAQ Mandiri.</w:t>
+      </w:r>
+    </w:p>
+    <w:p>
+      <w:pPr>
+        <w:spacing w:after="70" w:before="50" w:line="260"/>
       </w:pPr>
       <w:r>
         <w:rPr>
           <w:rFonts w:ascii="Times New Roman" w:cs="Times New Roman" w:eastAsia="Times New Roman" w:hAnsi="Times New Roman"/>
           <w:b/>
           <w:bCs/>
-          <w:sz w:val="22"/>
-          <w:szCs w:val="22"/>
+          <w:sz w:val="21"/>
+          <w:szCs w:val="21"/>
         </w:rPr>
         <w:t xml:space="preserve">1.3. Tujuan Fitur</w:t>
       </w:r>
     </w:p>
     <w:p>
       <w:pPr>
-        <w:spacing w:after="80" w:before="60" w:line="276"/>
-      </w:pPr>
-      <w:r>
-        <w:rPr>
-          <w:rFonts w:ascii="Times New Roman" w:cs="Times New Roman" w:eastAsia="Times New Roman" w:hAnsi="Times New Roman"/>
-          <w:sz w:val="22"/>
-          <w:szCs w:val="22"/>
-        </w:rPr>
-        <w:t xml:space="preserve">Memfasilitasi calon penumpang untuk merumuskan kueri pencarian, menemukan, menyaring, membandingkan tarif, serta memilih jadwal perjalanan kereta api antarkota yang paling sesuai dengan kebutuhan waktu dan anggaran mereka secara cepat, efisien, dan bebas friksi kognitif (cognitive overload).</w:t>
-      </w:r>
-    </w:p>
-    <w:p>
-      <w:pPr>
-        <w:spacing w:after="80" w:before="60" w:line="276"/>
+        <w:spacing w:after="70" w:before="50" w:line="260"/>
+      </w:pPr>
+      <w:r>
+        <w:rPr>
+          <w:rFonts w:ascii="Times New Roman" w:cs="Times New Roman" w:eastAsia="Times New Roman" w:hAnsi="Times New Roman"/>
+          <w:sz w:val="21"/>
+          <w:szCs w:val="21"/>
+        </w:rPr>
+        <w:t xml:space="preserve">Memfasilitasi calon penumpang untuk merumuskan kueri, mencari, menyaring, membandingkan tarif antartanggal, serta memilih jadwal kereta api yang paling ideal secara cepat, akurat, dan bebas beban kognitif.</w:t>
+      </w:r>
+    </w:p>
+    <w:p>
+      <w:pPr>
+        <w:spacing w:after="70" w:before="50" w:line="260"/>
       </w:pPr>
       <w:r>
         <w:rPr>
           <w:rFonts w:ascii="Times New Roman" w:cs="Times New Roman" w:eastAsia="Times New Roman" w:hAnsi="Times New Roman"/>
           <w:b/>
           <w:bCs/>
-          <w:sz w:val="22"/>
-          <w:szCs w:val="22"/>
-        </w:rPr>
-        <w:t xml:space="preserve">1.4. Informasi yang Ingin Ditemukan Pengguna (Information Needs)</w:t>
-      </w:r>
-    </w:p>
-    <w:p>
-      <w:pPr>
-        <w:spacing w:after="80" w:before="60" w:line="276"/>
-      </w:pPr>
-      <w:r>
-        <w:rPr>
-          <w:rFonts w:ascii="Times New Roman" w:cs="Times New Roman" w:eastAsia="Times New Roman" w:hAnsi="Times New Roman"/>
-          <w:sz w:val="22"/>
-          <w:szCs w:val="22"/>
-        </w:rPr>
-        <w:t xml:space="preserve">• Informasi Perjalanan: Ketersediaan jadwal keberangkatan dan kedatangan, stasiun asal-tujuan, stasiun singgah, dan visualisasi jalur rel geografis yang dilalui.
-• Informasi Fasilitas &amp; Kuota: Kelas kereta api (Ekonomi, Bisnis, Eksekutif, Luxury), denah gerbong, dan sisa kuota kursi secara real-time.
-• Informasi Finansial: Tarif tiket resmi, indikator harga termurah (best price), serta voucher diskon promo.
-• Informasi Ketentuan &amp; Regulasi: Syarat usia tiket anak/bayi, batas berat bagasi gratis, ketentuan pembatalan (refund), dan tata cara boarding.</w:t>
-      </w:r>
-    </w:p>
-    <w:p>
-      <w:pPr>
-        <w:spacing w:after="80" w:before="60" w:line="276"/>
+          <w:sz w:val="21"/>
+          <w:szCs w:val="21"/>
+        </w:rPr>
+        <w:t xml:space="preserve">1.4. Kebutuhan Informasi Pengguna (Information Needs)</w:t>
+      </w:r>
+    </w:p>
+    <w:p>
+      <w:pPr>
+        <w:spacing w:after="70" w:before="50" w:line="260"/>
+      </w:pPr>
+      <w:r>
+        <w:rPr>
+          <w:rFonts w:ascii="Times New Roman" w:cs="Times New Roman" w:eastAsia="Times New Roman" w:hAnsi="Times New Roman"/>
+          <w:sz w:val="21"/>
+          <w:szCs w:val="21"/>
+        </w:rPr>
+        <w:t xml:space="preserve">• Informasi Jadwal &amp; Rute: Waktu keberangkatan dan kedatangan, stasiun asal-tujuan, dan visualisasi rute spasial.
+• Informasi Fasilitas &amp; Kursi: Kelas kereta (Ekonomi, Bisnis, Eksekutif, Luxury) dan sisa kuota kursi secara real-time.
+• Informasi Tarif &amp; Promo: Harga tiket resmi, opsi tarif termurah, serta potongan voucher promo.
+• Informasi Regulasi: Aturan bagasi, ketentuan pembatalan/refund, dan persyaratan tiket anak.</w:t>
+      </w:r>
+    </w:p>
+    <w:p>
+      <w:pPr>
+        <w:spacing w:after="70" w:before="50" w:line="260"/>
       </w:pPr>
       <w:r>
         <w:rPr>
           <w:rFonts w:ascii="Times New Roman" w:cs="Times New Roman" w:eastAsia="Times New Roman" w:hAnsi="Times New Roman"/>
           <w:b/>
           <w:bCs/>
-          <w:sz w:val="22"/>
-          <w:szCs w:val="22"/>
+          <w:sz w:val="21"/>
+          <w:szCs w:val="21"/>
         </w:rPr>
         <w:t xml:space="preserve">1.5. Target Pengguna (User Persona)</w:t>
       </w:r>
     </w:p>
     <w:p>
       <w:pPr>
-        <w:spacing w:after="80" w:before="60" w:line="276"/>
-      </w:pPr>
-      <w:r>
-        <w:rPr>
-          <w:rFonts w:ascii="Times New Roman" w:cs="Times New Roman" w:eastAsia="Times New Roman" w:hAnsi="Times New Roman"/>
-          <w:sz w:val="22"/>
-          <w:szCs w:val="22"/>
-        </w:rPr>
-        <w:t xml:space="preserve">• Mahasiswa &amp; Pekerja Komuter (misal: Persona Muhammad Zidan &amp; Nurihisha Nadia): Mengutamakan efisiensi pencarian tarif termurah, jam keberangkatan tercepat, dan kemudahan menemukan promo.
-• Wisatawan &amp; Keluarga: Membutuhkan kepastian rute, perbandingan kelas kenyamanan gerbong, dan pemilihan kursi berdampingan.
-• Pengguna Baru / Pemula (First-time Users): Calon penumpang yang belum hafal singkatan kode 3 huruf stasiun di Pulau Jawa dan membutuhkan panduan visual peta rute.</w:t>
+        <w:spacing w:after="70" w:before="50" w:line="260"/>
+      </w:pPr>
+      <w:r>
+        <w:rPr>
+          <w:rFonts w:ascii="Times New Roman" w:cs="Times New Roman" w:eastAsia="Times New Roman" w:hAnsi="Times New Roman"/>
+          <w:sz w:val="21"/>
+          <w:szCs w:val="21"/>
+        </w:rPr>
+        <w:t xml:space="preserve">• Mahasiswa &amp; Pekerja Komuter: Mengutamakan kecepatan pencarian tiket termurah dan jam berangkat pagi/malam.
+• Wisatawan &amp; Keluarga: Membutuhkan kejelasan rute kota tujuan dan perbandingan kenyamanan kelas kursi.
+• Penumpang Pemula: Memerlukan bantuan visual rute peta karena belum hafal letak dan singkatan kode stasiun.</w:t>
       </w:r>
     </w:p>
     <w:p>
@@ -295,28 +295,28 @@
           <w:b/>
           <w:bCs/>
           <w:color w:val="003C71"/>
-          <w:sz w:val="28"/>
-          <w:szCs w:val="28"/>
+          <w:sz w:val="26"/>
+          <w:szCs w:val="26"/>
         </w:rPr>
         <w:t xml:space="preserve">2. ANALISIS PROSES INFORMATION SEARCH</w:t>
       </w:r>
     </w:p>
     <w:p>
       <w:pPr>
-        <w:spacing w:after="80" w:before="60" w:line="276"/>
-      </w:pPr>
-      <w:r>
-        <w:rPr>
-          <w:rFonts w:ascii="Times New Roman" w:cs="Times New Roman" w:eastAsia="Times New Roman" w:hAnsi="Times New Roman"/>
-          <w:sz w:val="22"/>
-          <w:szCs w:val="22"/>
-        </w:rPr>
-        <w:t xml:space="preserve">Bagian ini mengamati dan mengevaluasi alur interaksi pengguna ketika mencari informasi tiket kereta api berdasarkan 11 indikator evaluasi IMK:</w:t>
-      </w:r>
-    </w:p>
-    <w:p>
-      <w:pPr>
-        <w:spacing w:after="40" w:before="140"/>
+        <w:spacing w:after="70" w:before="50" w:line="260"/>
+      </w:pPr>
+      <w:r>
+        <w:rPr>
+          <w:rFonts w:ascii="Times New Roman" w:cs="Times New Roman" w:eastAsia="Times New Roman" w:hAnsi="Times New Roman"/>
+          <w:sz w:val="21"/>
+          <w:szCs w:val="21"/>
+        </w:rPr>
+        <w:t xml:space="preserve">Berikut evaluasi alur penemuan informasi pengguna berdasarkan 11 indikator IMK:</w:t>
+      </w:r>
+    </w:p>
+    <w:p>
+      <w:pPr>
+        <w:spacing w:after="30" w:before="120"/>
       </w:pPr>
       <w:r>
         <w:rPr>
@@ -324,28 +324,28 @@
           <w:b/>
           <w:bCs/>
           <w:color w:val="003C71"/>
-          <w:sz w:val="22"/>
-          <w:szCs w:val="22"/>
+          <w:sz w:val="21"/>
+          <w:szCs w:val="21"/>
         </w:rPr>
         <w:t xml:space="preserve">1. Bagaimana pengguna memulai pencarian?</w:t>
       </w:r>
     </w:p>
     <w:p>
       <w:pPr>
-        <w:spacing w:after="100" w:before="40" w:line="276"/>
-      </w:pPr>
-      <w:r>
-        <w:rPr>
-          <w:rFonts w:ascii="Times New Roman" w:cs="Times New Roman" w:eastAsia="Times New Roman" w:hAnsi="Times New Roman"/>
-          <w:sz w:val="22"/>
-          <w:szCs w:val="22"/>
-        </w:rPr>
-        <w:t xml:space="preserve">Pengguna memulai pencarian melalui formulir pencarian terpadu (Search Card) yang terletak terpusat pada Hero Section di halaman beranda. Pengguna menentukan stasiun asal, stasiun tujuan (didukung tombol swap satu klik), tipe perjalanan (sekali jalan / pulang-pergi), tanggal keberangkatan, dan jumlah penumpang. Sebagai alternatif, pengguna juga dapat memulai pencarian secara spasial melalui tombol 'Pilih Rute via Peta' yang membuka peta rute interaktif Pulau Jawa.</w:t>
-      </w:r>
-    </w:p>
-    <w:p>
-      <w:pPr>
-        <w:spacing w:after="40" w:before="140"/>
+        <w:spacing w:after="90" w:before="30" w:line="260"/>
+      </w:pPr>
+      <w:r>
+        <w:rPr>
+          <w:rFonts w:ascii="Times New Roman" w:cs="Times New Roman" w:eastAsia="Times New Roman" w:hAnsi="Times New Roman"/>
+          <w:sz w:val="21"/>
+          <w:szCs w:val="21"/>
+        </w:rPr>
+        <w:t xml:space="preserve">Pengguna memulai pencarian dari Search Card yang berada di halaman utama. Di bagian ini, pengguna memilih stasiun asal, stasiun tujuan, tipe perjalanan, tanggal keberangkatan, dan jumlah penumpang. Terdapat tombol swap untuk menukar stasiun secara instan, serta tombol 'Pilih Rute via Peta' untuk melihat rute secara visual.</w:t>
+      </w:r>
+    </w:p>
+    <w:p>
+      <w:pPr>
+        <w:spacing w:after="30" w:before="120"/>
       </w:pPr>
       <w:r>
         <w:rPr>
@@ -353,28 +353,28 @@
           <w:b/>
           <w:bCs/>
           <w:color w:val="003C71"/>
-          <w:sz w:val="22"/>
-          <w:szCs w:val="22"/>
+          <w:sz w:val="21"/>
+          <w:szCs w:val="21"/>
         </w:rPr>
         <w:t xml:space="preserve">2. Apakah fitur search mudah ditemukan?</w:t>
       </w:r>
     </w:p>
     <w:p>
       <w:pPr>
-        <w:spacing w:after="100" w:before="40" w:line="276"/>
-      </w:pPr>
-      <w:r>
-        <w:rPr>
-          <w:rFonts w:ascii="Times New Roman" w:cs="Times New Roman" w:eastAsia="Times New Roman" w:hAnsi="Times New Roman"/>
-          <w:sz w:val="22"/>
-          <w:szCs w:val="22"/>
-        </w:rPr>
-        <w:t xml:space="preserve">Sangat mudah ditemukan (High Visibility). Kotak pencarian utama berada tepat di atas lipatan layar (above the fold) beranda dengan kontras tinggi (kartu putih berbayang halus di atas latar belakang biru tua KAI #003C71). Dilengkapi ikon-ikon penjelas universal (MapPin, Navigation, Calendar, Users) yang mengarahkan fokus visual pengguna secara alami.</w:t>
-      </w:r>
-    </w:p>
-    <w:p>
-      <w:pPr>
-        <w:spacing w:after="40" w:before="140"/>
+        <w:spacing w:after="90" w:before="30" w:line="260"/>
+      </w:pPr>
+      <w:r>
+        <w:rPr>
+          <w:rFonts w:ascii="Times New Roman" w:cs="Times New Roman" w:eastAsia="Times New Roman" w:hAnsi="Times New Roman"/>
+          <w:sz w:val="21"/>
+          <w:szCs w:val="21"/>
+        </w:rPr>
+        <w:t xml:space="preserve">Ya, sangat mudah ditemukan. Kotak pencarian berada di posisi utama (above the fold) halaman beranda dengan kontras warna yang tegas terhadap latar belakang. Ikon penjelas pada setiap kolom membantu pengguna mengenali fungsi masing-masing elemen dengan cepat.</w:t>
+      </w:r>
+    </w:p>
+    <w:p>
+      <w:pPr>
+        <w:spacing w:after="30" w:before="120"/>
       </w:pPr>
       <w:r>
         <w:rPr>
@@ -382,28 +382,28 @@
           <w:b/>
           <w:bCs/>
           <w:color w:val="003C71"/>
-          <w:sz w:val="22"/>
-          <w:szCs w:val="22"/>
+          <w:sz w:val="21"/>
+          <w:szCs w:val="21"/>
         </w:rPr>
         <w:t xml:space="preserve">3. Bagaimana pengguna memasukkan kata kunci?</w:t>
       </w:r>
     </w:p>
     <w:p>
       <w:pPr>
-        <w:spacing w:after="100" w:before="40" w:line="276"/>
-      </w:pPr>
-      <w:r>
-        <w:rPr>
-          <w:rFonts w:ascii="Times New Roman" w:cs="Times New Roman" w:eastAsia="Times New Roman" w:hAnsi="Times New Roman"/>
-          <w:sz w:val="22"/>
-          <w:szCs w:val="22"/>
-        </w:rPr>
-        <w:t xml:space="preserve">Pengguna mengklik kolom input stasiun asal atau tujuan, lalu mengetik nama stasiun (misal: 'Gambir'), nama kota (misal: 'Yogyakarta' atau 'Jogja'), maupun kode 3 huruf stasiun resmi KAI (misal: 'GMR', 'YK', 'BDO'). Sistem bersifat case-insensitive dan toleran terhadap pencarian parsial.</w:t>
-      </w:r>
-    </w:p>
-    <w:p>
-      <w:pPr>
-        <w:spacing w:after="40" w:before="140"/>
+        <w:spacing w:after="90" w:before="30" w:line="260"/>
+      </w:pPr>
+      <w:r>
+        <w:rPr>
+          <w:rFonts w:ascii="Times New Roman" w:cs="Times New Roman" w:eastAsia="Times New Roman" w:hAnsi="Times New Roman"/>
+          <w:sz w:val="21"/>
+          <w:szCs w:val="21"/>
+        </w:rPr>
+        <w:t xml:space="preserve">Pengguna memilih kolom stasiun asal atau tujuan, kemudian mengetik nama stasiun, kota, atau kode 3 huruf stasiun (misalnya 'GMR' untuk Gambir, 'YK' untuk Yogyakarta, atau 'BDO' untuk Bandung). Pencarian bersifat toleran (case-insensitive dan pencarian parsial).</w:t>
+      </w:r>
+    </w:p>
+    <w:p>
+      <w:pPr>
+        <w:spacing w:after="30" w:before="120"/>
       </w:pPr>
       <w:r>
         <w:rPr>
@@ -411,28 +411,28 @@
           <w:b/>
           <w:bCs/>
           <w:color w:val="003C71"/>
-          <w:sz w:val="22"/>
-          <w:szCs w:val="22"/>
+          <w:sz w:val="21"/>
+          <w:szCs w:val="21"/>
         </w:rPr>
         <w:t xml:space="preserve">4. Apakah terdapat autocomplete atau search suggestion?</w:t>
       </w:r>
     </w:p>
     <w:p>
       <w:pPr>
-        <w:spacing w:after="100" w:before="40" w:line="276"/>
-      </w:pPr>
-      <w:r>
-        <w:rPr>
-          <w:rFonts w:ascii="Times New Roman" w:cs="Times New Roman" w:eastAsia="Times New Roman" w:hAnsi="Times New Roman"/>
-          <w:sz w:val="22"/>
-          <w:szCs w:val="22"/>
-        </w:rPr>
-        <w:t xml:space="preserve">Ya, sistem dilengkapi Smart Autocomplete &amp; Suggestion Modal. Sebelum pengguna mengetik, modal langsung menampilkan daftar 'Stasiun Populer' (Gambir, Bandung, Yogyakarta, Surabaya, dll). Saat pengguna mulai mengetik, daftar stasiun langsung terfilter secara real-time lengkap dengan lencana kota dan kode stasiun resmi.</w:t>
-      </w:r>
-    </w:p>
-    <w:p>
-      <w:pPr>
-        <w:spacing w:after="40" w:before="140"/>
+        <w:spacing w:after="90" w:before="30" w:line="260"/>
+      </w:pPr>
+      <w:r>
+        <w:rPr>
+          <w:rFonts w:ascii="Times New Roman" w:cs="Times New Roman" w:eastAsia="Times New Roman" w:hAnsi="Times New Roman"/>
+          <w:sz w:val="21"/>
+          <w:szCs w:val="21"/>
+        </w:rPr>
+        <w:t xml:space="preserve">Ya, sistem menyediakan Smart Autocomplete Modal. Sebelum mengetik, pengguna langsung disajikan rekomendasi 'Stasiun Populer'. Saat pengguna mulai mengetik huruf awal, daftar pilihan otomatis tersaring secara real-time lengkap dengan lencana kota dan kode stasiun.</w:t>
+      </w:r>
+    </w:p>
+    <w:p>
+      <w:pPr>
+        <w:spacing w:after="30" w:before="120"/>
       </w:pPr>
       <w:r>
         <w:rPr>
@@ -440,28 +440,28 @@
           <w:b/>
           <w:bCs/>
           <w:color w:val="003C71"/>
-          <w:sz w:val="22"/>
-          <w:szCs w:val="22"/>
+          <w:sz w:val="21"/>
+          <w:szCs w:val="21"/>
         </w:rPr>
         <w:t xml:space="preserve">5. Bagaimana hasil pencarian ditampilkan?</w:t>
       </w:r>
     </w:p>
     <w:p>
       <w:pPr>
-        <w:spacing w:after="100" w:before="40" w:line="276"/>
-      </w:pPr>
-      <w:r>
-        <w:rPr>
-          <w:rFonts w:ascii="Times New Roman" w:cs="Times New Roman" w:eastAsia="Times New Roman" w:hAnsi="Times New Roman"/>
-          <w:sz w:val="22"/>
-          <w:szCs w:val="22"/>
-        </w:rPr>
-        <w:t xml:space="preserve">Hasil pencarian pada halaman /cari disajikan dalam bentuk daftar kartu kereta (Train Cards) terstruktur vertikal: jam berangkat &amp; tiba di kiri dan kanan, garis alur durasi di tengah, nama dan nomor KA dicetak tegas, lencana kelas kursi warna-warni, serta harga tebal di sisi kanan bersebelahan dengan tombol aksi 'Pilih'.</w:t>
-      </w:r>
-    </w:p>
-    <w:p>
-      <w:pPr>
-        <w:spacing w:after="40" w:before="140"/>
+        <w:spacing w:after="90" w:before="30" w:line="260"/>
+      </w:pPr>
+      <w:r>
+        <w:rPr>
+          <w:rFonts w:ascii="Times New Roman" w:cs="Times New Roman" w:eastAsia="Times New Roman" w:hAnsi="Times New Roman"/>
+          <w:sz w:val="21"/>
+          <w:szCs w:val="21"/>
+        </w:rPr>
+        <w:t xml:space="preserve">Hasil pencarian disajikan dalam bentuk daftar kartu kereta (Train Cards) terstruktur: waktu keberangkatan dan kedatangan di kiri-kanan, alur durasi perjalanan di tengah, nama KA dan lencana kelas kursi yang jelas, serta tarif tebal di samping tombol aksi 'Pilih'.</w:t>
+      </w:r>
+    </w:p>
+    <w:p>
+      <w:pPr>
+        <w:spacing w:after="30" w:before="120"/>
       </w:pPr>
       <w:r>
         <w:rPr>
@@ -469,28 +469,28 @@
           <w:b/>
           <w:bCs/>
           <w:color w:val="003C71"/>
-          <w:sz w:val="22"/>
-          <w:szCs w:val="22"/>
+          <w:sz w:val="21"/>
+          <w:szCs w:val="21"/>
         </w:rPr>
         <w:t xml:space="preserve">6. Apakah hasil yang paling relevan mudah ditemukan?</w:t>
       </w:r>
     </w:p>
     <w:p>
       <w:pPr>
-        <w:spacing w:after="100" w:before="40" w:line="276"/>
-      </w:pPr>
-      <w:r>
-        <w:rPr>
-          <w:rFonts w:ascii="Times New Roman" w:cs="Times New Roman" w:eastAsia="Times New Roman" w:hAnsi="Times New Roman"/>
-          <w:sz w:val="22"/>
-          <w:szCs w:val="22"/>
-        </w:rPr>
-        <w:t xml:space="preserve">Sangat mudah ditemukan. Jadwal langsung (direct train) yang melayani rute asal-tujuan diletakkan di urutan teratas. Selain itu, terdapat Date Strip Carousel tepat di atas daftar tiket yang memperlihatkan perbandingan harga termurah pada H-3 hingga H+3, memudahkan pengguna menemukan opsi paling hemat dalam 1 klik.</w:t>
-      </w:r>
-    </w:p>
-    <w:p>
-      <w:pPr>
-        <w:spacing w:after="40" w:before="140"/>
+        <w:spacing w:after="90" w:before="30" w:line="260"/>
+      </w:pPr>
+      <w:r>
+        <w:rPr>
+          <w:rFonts w:ascii="Times New Roman" w:cs="Times New Roman" w:eastAsia="Times New Roman" w:hAnsi="Times New Roman"/>
+          <w:sz w:val="21"/>
+          <w:szCs w:val="21"/>
+        </w:rPr>
+        <w:t xml:space="preserve">Sangat mudah. Jadwal langsung (direct) diletakkan di urutan teratas. Selain itu, terdapat Date Strip Carousel di atas daftar hasil pencarian yang menampilkan tarif termurah pada H-3 hingga H+3, memudahkan pengguna membandingkan harga dalam 1 klik.</w:t>
+      </w:r>
+    </w:p>
+    <w:p>
+      <w:pPr>
+        <w:spacing w:after="30" w:before="120"/>
       </w:pPr>
       <w:r>
         <w:rPr>
@@ -498,28 +498,28 @@
           <w:b/>
           <w:bCs/>
           <w:color w:val="003C71"/>
-          <w:sz w:val="22"/>
-          <w:szCs w:val="22"/>
+          <w:sz w:val="21"/>
+          <w:szCs w:val="21"/>
         </w:rPr>
         <w:t xml:space="preserve">7. Apakah tersedia filter?</w:t>
       </w:r>
     </w:p>
     <w:p>
       <w:pPr>
-        <w:spacing w:after="100" w:before="40" w:line="276"/>
-      </w:pPr>
-      <w:r>
-        <w:rPr>
-          <w:rFonts w:ascii="Times New Roman" w:cs="Times New Roman" w:eastAsia="Times New Roman" w:hAnsi="Times New Roman"/>
-          <w:sz w:val="22"/>
-          <w:szCs w:val="22"/>
-        </w:rPr>
-        <w:t xml:space="preserve">Ya, tersedia Panel Filter Multi-Kategori di sisi kiri halaman hasil pencarian: (1) Filter Kelas Kereta (Ekonomi, Bisnis, Eksekutif, Luxury), (2) Filter Waktu Keberangkatan (Pagi, Siang, Sore, Malam), dan (3) Filter Nama Kereta Api. Filter bekerja secara reaktif dan memperbarui hasil seketika tanpa perlu me-reload halaman.</w:t>
-      </w:r>
-    </w:p>
-    <w:p>
-      <w:pPr>
-        <w:spacing w:after="40" w:before="140"/>
+        <w:spacing w:after="90" w:before="30" w:line="260"/>
+      </w:pPr>
+      <w:r>
+        <w:rPr>
+          <w:rFonts w:ascii="Times New Roman" w:cs="Times New Roman" w:eastAsia="Times New Roman" w:hAnsi="Times New Roman"/>
+          <w:sz w:val="21"/>
+          <w:szCs w:val="21"/>
+        </w:rPr>
+        <w:t xml:space="preserve">Ya, tersedia Toolbar Filter Dropdown berlatar biru primary (KAI Blue) tepat di atas hasil pencarian. Pengguna dapat menyaring Kelas (Ekonomi, Bisnis, Eksekutif) dan Waktu Keberangkatan (Pagi, Siang, Malam) via menu dropdown interaktif. Tersedia tombol Reset otomatis yang muncul ketika filter aktif, memperbarui hasil seketika tanpa reload halaman.</w:t>
+      </w:r>
+    </w:p>
+    <w:p>
+      <w:pPr>
+        <w:spacing w:after="30" w:before="120"/>
       </w:pPr>
       <w:r>
         <w:rPr>
@@ -527,28 +527,28 @@
           <w:b/>
           <w:bCs/>
           <w:color w:val="003C71"/>
-          <w:sz w:val="22"/>
-          <w:szCs w:val="22"/>
+          <w:sz w:val="21"/>
+          <w:szCs w:val="21"/>
         </w:rPr>
         <w:t xml:space="preserve">8. Apakah tersedia sorting?</w:t>
       </w:r>
     </w:p>
     <w:p>
       <w:pPr>
-        <w:spacing w:after="100" w:before="40" w:line="276"/>
-      </w:pPr>
-      <w:r>
-        <w:rPr>
-          <w:rFonts w:ascii="Times New Roman" w:cs="Times New Roman" w:eastAsia="Times New Roman" w:hAnsi="Times New Roman"/>
-          <w:sz w:val="22"/>
-          <w:szCs w:val="22"/>
-        </w:rPr>
-        <w:t xml:space="preserve">Ya, tersedia Menu Dropdown Sorting di bagian atas daftar hasil: Harga Terendah → Tertinggi (Default / Paling Hemat), Keberangkatan Paling Awal &amp; Paling Akhir, Kedatangan Paling Awal &amp; Paling Akhir, serta Durasi Perjalanan Tercepat.</w:t>
-      </w:r>
-    </w:p>
-    <w:p>
-      <w:pPr>
-        <w:spacing w:after="40" w:before="140"/>
+        <w:spacing w:after="90" w:before="30" w:line="260"/>
+      </w:pPr>
+      <w:r>
+        <w:rPr>
+          <w:rFonts w:ascii="Times New Roman" w:cs="Times New Roman" w:eastAsia="Times New Roman" w:hAnsi="Times New Roman"/>
+          <w:sz w:val="21"/>
+          <w:szCs w:val="21"/>
+        </w:rPr>
+        <w:t xml:space="preserve">Ya, tersedia Menu Dropdown Sorting pada toolbar di atas hasil pencarian: Harga Paling Murah (Default / Rekomendasi), Waktu: Paling Awal, Waktu: Paling Akhir, dan Durasi: Paling Cepat.</w:t>
+      </w:r>
+    </w:p>
+    <w:p>
+      <w:pPr>
+        <w:spacing w:after="30" w:before="120"/>
       </w:pPr>
       <w:r>
         <w:rPr>
@@ -556,28 +556,28 @@
           <w:b/>
           <w:bCs/>
           <w:color w:val="003C71"/>
-          <w:sz w:val="22"/>
-          <w:szCs w:val="22"/>
+          <w:sz w:val="21"/>
+          <w:szCs w:val="21"/>
         </w:rPr>
         <w:t xml:space="preserve">9. Apakah pengguna mendapatkan feedback dari sistem?</w:t>
       </w:r>
     </w:p>
     <w:p>
       <w:pPr>
-        <w:spacing w:after="100" w:before="40" w:line="276"/>
-      </w:pPr>
-      <w:r>
-        <w:rPr>
-          <w:rFonts w:ascii="Times New Roman" w:cs="Times New Roman" w:eastAsia="Times New Roman" w:hAnsi="Times New Roman"/>
-          <w:sz w:val="22"/>
-          <w:szCs w:val="22"/>
-        </w:rPr>
-        <w:t xml:space="preserve">Ya, sistem memberikan umpan balik (feedback) instan pada setiap aksi: (1) Feedback Visual Peta: saat asal dan tujuan dipilih di peta rute, jalur rel nyata otomatis menyala oranye (#F58220) dan kamera peta melakukan auto-fit zoom membingkai rute; (2) Feedback Kuota Kursi: lencana oranye menyala jika kursi tersisa sedikit; (3) Feedback Promo: muncul notifikasi hijau saat kode promo aktif; (4) Feedback Loading: animasi skeleton loader saat data jadwal disaring.</w:t>
-      </w:r>
-    </w:p>
-    <w:p>
-      <w:pPr>
-        <w:spacing w:after="40" w:before="140"/>
+        <w:spacing w:after="90" w:before="30" w:line="260"/>
+      </w:pPr>
+      <w:r>
+        <w:rPr>
+          <w:rFonts w:ascii="Times New Roman" w:cs="Times New Roman" w:eastAsia="Times New Roman" w:hAnsi="Times New Roman"/>
+          <w:sz w:val="21"/>
+          <w:szCs w:val="21"/>
+        </w:rPr>
+        <w:t xml:space="preserve">Ya, sistem memberikan umpan balik langsung pada setiap aksi: (1) Feedback visual peta menyala oranye (#F58220) saat asal-tujuan dipilih, (2) Lencana oranye peringatan sisa kuota kursi, (3) Notifikasi hijau saat promo aktif, dan (4) Skeleton loading saat data diperbarui.</w:t>
+      </w:r>
+    </w:p>
+    <w:p>
+      <w:pPr>
+        <w:spacing w:after="30" w:before="120"/>
       </w:pPr>
       <w:r>
         <w:rPr>
@@ -585,28 +585,28 @@
           <w:b/>
           <w:bCs/>
           <w:color w:val="003C71"/>
-          <w:sz w:val="22"/>
-          <w:szCs w:val="22"/>
+          <w:sz w:val="21"/>
+          <w:szCs w:val="21"/>
         </w:rPr>
         <w:t xml:space="preserve">10. Apa yang terjadi jika pencarian tidak menghasilkan informasi (Empty State)?</w:t>
       </w:r>
     </w:p>
     <w:p>
       <w:pPr>
-        <w:spacing w:after="100" w:before="40" w:line="276"/>
-      </w:pPr>
-      <w:r>
-        <w:rPr>
-          <w:rFonts w:ascii="Times New Roman" w:cs="Times New Roman" w:eastAsia="Times New Roman" w:hAnsi="Times New Roman"/>
-          <w:sz w:val="22"/>
-          <w:szCs w:val="22"/>
-        </w:rPr>
-        <w:t xml:space="preserve">Sistem tidak menampilkan halaman kosong kaku atau kode galat teknis. Sistem menyajikan Empty State yang ramah berilustrasi maskot KAI dengan pesan empatik 'Jadwal Kereta Tidak Ditemukan', disertai rekomendasi solutif: mengubah tanggal keberangkatan melalui kalender tarif, memeriksa rute alternatif stasiun terdekat, atau tombol kembali ke beranda.</w:t>
-      </w:r>
-    </w:p>
-    <w:p>
-      <w:pPr>
-        <w:spacing w:after="40" w:before="140"/>
+        <w:spacing w:after="90" w:before="30" w:line="260"/>
+      </w:pPr>
+      <w:r>
+        <w:rPr>
+          <w:rFonts w:ascii="Times New Roman" w:cs="Times New Roman" w:eastAsia="Times New Roman" w:hAnsi="Times New Roman"/>
+          <w:sz w:val="21"/>
+          <w:szCs w:val="21"/>
+        </w:rPr>
+        <w:t xml:space="preserve">Sistem menyajikan Empty State empatik berilustrasi maskot KAI dengan pesan ramah 'Jadwal Kereta Tidak Ditemukan', dilengkapi rekomendasi solutif: tombol mengganti tanggal keberangkatan atau memeriksa rute alternatif via Peta Rute.</w:t>
+      </w:r>
+    </w:p>
+    <w:p>
+      <w:pPr>
+        <w:spacing w:after="30" w:before="120"/>
       </w:pPr>
       <w:r>
         <w:rPr>
@@ -614,26 +614,26 @@
           <w:b/>
           <w:bCs/>
           <w:color w:val="003C71"/>
-          <w:sz w:val="22"/>
-          <w:szCs w:val="22"/>
+          <w:sz w:val="21"/>
+          <w:szCs w:val="21"/>
         </w:rPr>
         <w:t xml:space="preserve">11. Berapa langkah yang diperlukan pengguna sampai menemukan informasi yang dicari?</w:t>
       </w:r>
     </w:p>
     <w:p>
       <w:pPr>
-        <w:spacing w:after="100" w:before="40" w:line="276"/>
-      </w:pPr>
-      <w:r>
-        <w:rPr>
-          <w:rFonts w:ascii="Times New Roman" w:cs="Times New Roman" w:eastAsia="Times New Roman" w:hAnsi="Times New Roman"/>
-          <w:sz w:val="22"/>
-          <w:szCs w:val="22"/>
-        </w:rPr>
-        <w:t xml:space="preserve">Secara umum, pengguna hanya memerlukan 2 langkah aksi utama (two-action steps) untuk menemukan informasi jadwal dan tarif kereta yang diinginkan:
-1. Langkah 1 (Spesifikasi Parameter): Memilih stasiun asal, tujuan, dan tanggal pada formulir beranda (didukung Smart Suggestion stasiun populer &amp; terdekat).
-2. Langkah 2 (Eksekusi Pencarian): Menekan tombol 'Cari Tiket'. Sistem seketika menyajikan hasil pencarian lengkap dengan matriks harga dan jadwal.
-Jika pengguna memerlukan penyaringan spesifik (kelas atau jam tertentu), pengguna cukup melakukan 1 langkah penyempurnaan (refinement step) menggunakan toolbar filter/sorting yang memperbarui hasil secara instan tanpa reload halaman. Selain itu, perbandingan harga antartanggal dapat dilakukan dalam 1 klik langsung pada Date Strip Carousel.</w:t>
+        <w:spacing w:after="90" w:before="30" w:line="260"/>
+      </w:pPr>
+      <w:r>
+        <w:rPr>
+          <w:rFonts w:ascii="Times New Roman" w:cs="Times New Roman" w:eastAsia="Times New Roman" w:hAnsi="Times New Roman"/>
+          <w:sz w:val="21"/>
+          <w:szCs w:val="21"/>
+        </w:rPr>
+        <w:t xml:space="preserve">Pengguna hanya memerlukan sekitar 2 sampai 3 langkah utama:
+• Langkah 1: Memilih stasiun asal, stasiun tujuan, dan tanggal keberangkatan pada formulir beranda (atau via Peta Rute).
+• Langkah 2: Menekan tombol 'Cari Tiket' untuk mengeksekusi pencarian.
+• Langkah 3: Pengguna langsung melihat jadwal dan harga tiket pada halaman hasil, serta dapat menggunakan filter dropdown atau sorting jika memerlukan penyaringan lebih lanjut.</w:t>
       </w:r>
     </w:p>
     <w:p>
@@ -647,114 +647,114 @@
           <w:b/>
           <w:bCs/>
           <w:color w:val="003C71"/>
-          <w:sz w:val="28"/>
-          <w:szCs w:val="28"/>
-        </w:rPr>
-        <w:t xml:space="preserve">3. SOLUSI REDESIGN DAN INOVASI FITUR</w:t>
-      </w:r>
-    </w:p>
-    <w:p>
-      <w:pPr>
-        <w:spacing w:after="80" w:before="60" w:line="276"/>
-      </w:pPr>
-      <w:r>
-        <w:rPr>
-          <w:rFonts w:ascii="Times New Roman" w:cs="Times New Roman" w:eastAsia="Times New Roman" w:hAnsi="Times New Roman"/>
-          <w:sz w:val="22"/>
-          <w:szCs w:val="22"/>
-        </w:rPr>
-        <w:t xml:space="preserve">Berdasarkan evaluasi masalah pada sistem pemesanan konvensional, dibuat solusi redesain pada aspek-aspek berikut:</w:t>
-      </w:r>
-    </w:p>
-    <w:p>
-      <w:pPr>
-        <w:spacing w:after="80" w:before="60" w:line="276"/>
-      </w:pPr>
-      <w:r>
-        <w:rPr>
-          <w:rFonts w:ascii="Times New Roman" w:cs="Times New Roman" w:eastAsia="Times New Roman" w:hAnsi="Times New Roman"/>
-          <w:sz w:val="22"/>
-          <w:szCs w:val="22"/>
-        </w:rPr>
-        <w:t xml:space="preserve">1. Search Bar &amp; Suggestion: Mengganti dropdown teks kaku dengan modal pencarian terfokus (focused modal overlay) yang menyajikan rekomendasi 'Stasiun Populer', pengelompokan kota, dan toleransi singkatan kode stasiun.</w:t>
-      </w:r>
-    </w:p>
-    <w:p>
-      <w:pPr>
-        <w:spacing w:after="80" w:before="60" w:line="276"/>
-      </w:pPr>
-      <w:r>
-        <w:rPr>
-          <w:rFonts w:ascii="Times New Roman" w:cs="Times New Roman" w:eastAsia="Times New Roman" w:hAnsi="Times New Roman"/>
-          <w:sz w:val="22"/>
-          <w:szCs w:val="22"/>
-        </w:rPr>
-        <w:t xml:space="preserve">2. Navigasi Spasial (Peta Rute Interaktif Pulau Jawa): Menyediakan alternatif penemuan rute visual di /peta-rute bagi pengguna yang tidak hafal lokasi stasiun, lengkap dengan visualisasi jalur rel aktif berwarna oranye yang menelusuri lekukan rel nyata OpenStreetMap.</w:t>
-      </w:r>
-    </w:p>
-    <w:p>
-      <w:pPr>
-        <w:spacing w:after="80" w:before="60" w:line="276"/>
-      </w:pPr>
-      <w:r>
-        <w:rPr>
-          <w:rFonts w:ascii="Times New Roman" w:cs="Times New Roman" w:eastAsia="Times New Roman" w:hAnsi="Times New Roman"/>
-          <w:sz w:val="22"/>
-          <w:szCs w:val="22"/>
-        </w:rPr>
-        <w:t xml:space="preserve">3. Date Strip Carousel (Perbandingan Tarif Antartanggal): Menambahkan carousel tanggal di atas hasil pencarian untuk melihat tarif termurah di hari sebelum/sesudahnya tanpa perlu mengulang input pencarian.</w:t>
-      </w:r>
-    </w:p>
-    <w:p>
-      <w:pPr>
-        <w:spacing w:after="80" w:before="60" w:line="276"/>
-      </w:pPr>
-      <w:r>
-        <w:rPr>
-          <w:rFonts w:ascii="Times New Roman" w:cs="Times New Roman" w:eastAsia="Times New Roman" w:hAnsi="Times New Roman"/>
-          <w:sz w:val="22"/>
-          <w:szCs w:val="22"/>
-        </w:rPr>
-        <w:t xml:space="preserve">4. Panel Filter &amp; Sorting Terbuka: Filter diletakkan di sisi kiri halaman hasil pencarian sehingga pengguna dapat langsung menyaring kelas dan jam dalam 1 klik (direct manipulation).</w:t>
-      </w:r>
-    </w:p>
-    <w:p>
-      <w:pPr>
-        <w:spacing w:after="80" w:before="60" w:line="276"/>
-      </w:pPr>
-      <w:r>
-        <w:rPr>
-          <w:rFonts w:ascii="Times New Roman" w:cs="Times New Roman" w:eastAsia="Times New Roman" w:hAnsi="Times New Roman"/>
-          <w:sz w:val="22"/>
-          <w:szCs w:val="22"/>
-        </w:rPr>
-        <w:t xml:space="preserve">5. Empty State &amp; Feedback Responsif: Mengganti pesan error kaku dengan ilustrasi maskot KAI dan panduan mencari rute/tanggal alternatif.</w:t>
-      </w:r>
-    </w:p>
-    <w:p>
-      <w:pPr>
-        <w:spacing w:after="80" w:before="60" w:line="276"/>
-      </w:pPr>
-      <w:r>
-        <w:rPr>
-          <w:rFonts w:ascii="Times New Roman" w:cs="Times New Roman" w:eastAsia="Times New Roman" w:hAnsi="Times New Roman"/>
-          <w:sz w:val="22"/>
-          <w:szCs w:val="22"/>
-        </w:rPr>
-        <w:t xml:space="preserve">6. Inovasi Fitur Baru — Pusat Promo Terintegrasi (/promo): Menyediakan halaman khusus promo dengan tombol 'Pakai Promo' yang otomatis memasang stasiun dan voucher di formulir beranda.</w:t>
-      </w:r>
-    </w:p>
-    <w:p>
-      <w:pPr>
-        <w:spacing w:after="80" w:before="60" w:line="276"/>
-      </w:pPr>
-      <w:r>
-        <w:rPr>
-          <w:rFonts w:ascii="Times New Roman" w:cs="Times New Roman" w:eastAsia="Times New Roman" w:hAnsi="Times New Roman"/>
-          <w:sz w:val="22"/>
-          <w:szCs w:val="22"/>
-        </w:rPr>
-        <w:t xml:space="preserve">7. Inovasi Fitur Baru — Knowledge Search FAQ (/faq): Menyediakan pencarian informasi aturan, bagasi, dan refund secara mandiri dengan fitur text highlighting (kata kunci disorot kuning) dan 7 tab kategori tematik.</w:t>
+          <w:sz w:val="26"/>
+          <w:szCs w:val="26"/>
+        </w:rPr>
+        <w:t xml:space="preserve">3. SOLUSI REDESAIN DAN INOVASI FITUR</w:t>
+      </w:r>
+    </w:p>
+    <w:p>
+      <w:pPr>
+        <w:spacing w:after="70" w:before="50" w:line="260"/>
+      </w:pPr>
+      <w:r>
+        <w:rPr>
+          <w:rFonts w:ascii="Times New Roman" w:cs="Times New Roman" w:eastAsia="Times New Roman" w:hAnsi="Times New Roman"/>
+          <w:sz w:val="21"/>
+          <w:szCs w:val="21"/>
+        </w:rPr>
+        <w:t xml:space="preserve">Berdasarkan masalah yang diidentifikasi pada sistem lama, solusi redesain dirumuskan pada aspek-aspek utama berikut:</w:t>
+      </w:r>
+    </w:p>
+    <w:p>
+      <w:pPr>
+        <w:spacing w:after="70" w:before="50" w:line="260"/>
+      </w:pPr>
+      <w:r>
+        <w:rPr>
+          <w:rFonts w:ascii="Times New Roman" w:cs="Times New Roman" w:eastAsia="Times New Roman" w:hAnsi="Times New Roman"/>
+          <w:sz w:val="21"/>
+          <w:szCs w:val="21"/>
+        </w:rPr>
+        <w:t xml:space="preserve">1. Search Bar &amp; Suggestion: Mengganti dropdown teks kaku dengan modal pencarian terfokus yang menyajikan rekomendasi 'Stasiun Populer', pengelompokan kota, dan pencarian kode stasiun.</w:t>
+      </w:r>
+    </w:p>
+    <w:p>
+      <w:pPr>
+        <w:spacing w:after="70" w:before="50" w:line="260"/>
+      </w:pPr>
+      <w:r>
+        <w:rPr>
+          <w:rFonts w:ascii="Times New Roman" w:cs="Times New Roman" w:eastAsia="Times New Roman" w:hAnsi="Times New Roman"/>
+          <w:sz w:val="21"/>
+          <w:szCs w:val="21"/>
+        </w:rPr>
+        <w:t xml:space="preserve">2. Navigasi Spasial (Peta Rute Interaktif Pulau Jawa): Menambahkan halaman /peta-rute untuk mencari rute secara visual bagi pengguna yang belum hafal lokasi stasiun.</w:t>
+      </w:r>
+    </w:p>
+    <w:p>
+      <w:pPr>
+        <w:spacing w:after="70" w:before="50" w:line="260"/>
+      </w:pPr>
+      <w:r>
+        <w:rPr>
+          <w:rFonts w:ascii="Times New Roman" w:cs="Times New Roman" w:eastAsia="Times New Roman" w:hAnsi="Times New Roman"/>
+          <w:sz w:val="21"/>
+          <w:szCs w:val="21"/>
+        </w:rPr>
+        <w:t xml:space="preserve">3. Date Strip Carousel: Menambahkan pilihan tanggal di atas hasil pencarian untuk melihat tarif termurah di sekitar tanggal pilihan tanpa harus mengulang pencarian.</w:t>
+      </w:r>
+    </w:p>
+    <w:p>
+      <w:pPr>
+        <w:spacing w:after="70" w:before="50" w:line="260"/>
+      </w:pPr>
+      <w:r>
+        <w:rPr>
+          <w:rFonts w:ascii="Times New Roman" w:cs="Times New Roman" w:eastAsia="Times New Roman" w:hAnsi="Times New Roman"/>
+          <w:sz w:val="21"/>
+          <w:szCs w:val="21"/>
+        </w:rPr>
+        <w:t xml:space="preserve">4. Toolbar Filter Dropdown &amp; Sorting Terbuka: Filter dan sorting ditempatkan tepat di atas hasil pencarian agar mudah diakses dalam 1 baris terpadu.</w:t>
+      </w:r>
+    </w:p>
+    <w:p>
+      <w:pPr>
+        <w:spacing w:after="70" w:before="50" w:line="260"/>
+      </w:pPr>
+      <w:r>
+        <w:rPr>
+          <w:rFonts w:ascii="Times New Roman" w:cs="Times New Roman" w:eastAsia="Times New Roman" w:hAnsi="Times New Roman"/>
+          <w:sz w:val="21"/>
+          <w:szCs w:val="21"/>
+        </w:rPr>
+        <w:t xml:space="preserve">5. Empty State Responsif: Mengganti pesan error kaku dengan ilustrasi maskot ramah dan tombol panduan solutif.</w:t>
+      </w:r>
+    </w:p>
+    <w:p>
+      <w:pPr>
+        <w:spacing w:after="70" w:before="50" w:line="260"/>
+      </w:pPr>
+      <w:r>
+        <w:rPr>
+          <w:rFonts w:ascii="Times New Roman" w:cs="Times New Roman" w:eastAsia="Times New Roman" w:hAnsi="Times New Roman"/>
+          <w:sz w:val="21"/>
+          <w:szCs w:val="21"/>
+        </w:rPr>
+        <w:t xml:space="preserve">6. Pusat Promo Terintegrasi (/promo): Menyediakan pencarian promo dengan tombol 1-klik 'Pakai Promo' yang mengisi form pencarian secara otomatis.</w:t>
+      </w:r>
+    </w:p>
+    <w:p>
+      <w:pPr>
+        <w:spacing w:after="70" w:before="50" w:line="260"/>
+      </w:pPr>
+      <w:r>
+        <w:rPr>
+          <w:rFonts w:ascii="Times New Roman" w:cs="Times New Roman" w:eastAsia="Times New Roman" w:hAnsi="Times New Roman"/>
+          <w:sz w:val="21"/>
+          <w:szCs w:val="21"/>
+        </w:rPr>
+        <w:t xml:space="preserve">7. Knowledge Search FAQ (/faq): Menyediakan pencarian informasi aturan bagasi dan refund dengan fitur text highlighting (sorotan kuning).</w:t>
       </w:r>
     </w:p>
     <w:p>
@@ -768,23 +768,23 @@
           <w:b/>
           <w:bCs/>
           <w:color w:val="003C71"/>
-          <w:sz w:val="28"/>
-          <w:szCs w:val="28"/>
+          <w:sz w:val="26"/>
+          <w:szCs w:val="26"/>
         </w:rPr>
         <w:t xml:space="preserve">4. FORM ANALISIS PROJECT REDESIGN: BEFORE VS AFTER</w:t>
       </w:r>
     </w:p>
     <w:p>
       <w:pPr>
-        <w:spacing w:after="80" w:before="60" w:line="276"/>
-      </w:pPr>
-      <w:r>
-        <w:rPr>
-          <w:rFonts w:ascii="Times New Roman" w:cs="Times New Roman" w:eastAsia="Times New Roman" w:hAnsi="Times New Roman"/>
-          <w:sz w:val="22"/>
-          <w:szCs w:val="22"/>
-        </w:rPr>
-        <w:t xml:space="preserve">Tabel berikut menyajikan perbandingan apple-to-apple antara sistem eksisting (booking.kai.id) dan sistem hasil redesain (Booking KAI) pada materi Information Search:</w:t>
+        <w:spacing w:after="70" w:before="50" w:line="260"/>
+      </w:pPr>
+      <w:r>
+        <w:rPr>
+          <w:rFonts w:ascii="Times New Roman" w:cs="Times New Roman" w:eastAsia="Times New Roman" w:hAnsi="Times New Roman"/>
+          <w:sz w:val="21"/>
+          <w:szCs w:val="21"/>
+        </w:rPr>
+        <w:t xml:space="preserve">Tabel berikut menyajikan komparasi per poin (ringkas) antara sistem eksisting (booking.kai.id) dan sistem hasil redesain (Booking KAI):</w:t>
       </w:r>
     </w:p>
     <w:tbl>
@@ -823,6 +823,8 @@
                 <w:b/>
                 <w:bCs/>
                 <w:color w:val="FFFFFF"/>
+                <w:sz w:val="20"/>
+                <w:szCs w:val="20"/>
               </w:rPr>
               <w:t xml:space="preserve">Aspek / Fitur</w:t>
             </w:r>
@@ -842,8 +844,10 @@
                 <w:b/>
                 <w:bCs/>
                 <w:color w:val="FFFFFF"/>
-              </w:rPr>
-              <w:t xml:space="preserve">BEFORE (Kondisi Eksisting)</w:t>
+                <w:sz w:val="20"/>
+                <w:szCs w:val="20"/>
+              </w:rPr>
+              <w:t xml:space="preserve">BEFORE (Eksisting)</w:t>
             </w:r>
           </w:p>
         </w:tc>
@@ -861,8 +865,10 @@
                 <w:b/>
                 <w:bCs/>
                 <w:color w:val="FFFFFF"/>
-              </w:rPr>
-              <w:t xml:space="preserve">AFTER (Hasil Redesain)</w:t>
+                <w:sz w:val="20"/>
+                <w:szCs w:val="20"/>
+              </w:rPr>
+              <w:t xml:space="preserve">AFTER (Redesain)</w:t>
             </w:r>
           </w:p>
         </w:tc>
@@ -880,8 +886,10 @@
                 <w:b/>
                 <w:bCs/>
                 <w:color w:val="FFFFFF"/>
-              </w:rPr>
-              <w:t xml:space="preserve">Alasan / Prinsip IMK</w:t>
+                <w:sz w:val="20"/>
+                <w:szCs w:val="20"/>
+              </w:rPr>
+              <w:t xml:space="preserve">Prinsip IMK</w:t>
             </w:r>
           </w:p>
         </w:tc>
@@ -893,6 +901,8 @@
               <w:rPr>
                 <w:b/>
                 <w:bCs/>
+                <w:sz w:val="20"/>
+                <w:szCs w:val="20"/>
               </w:rPr>
               <w:t xml:space="preserve">1. Search / Pencarian</w:t>
             </w:r>
@@ -900,18 +910,40 @@
         </w:tc>
         <w:tc>
           <w:p>
-            <w:r>
-              <w:t xml:space="preserve">Formulir input konvensional kaku dengan label terpisah dan latar belakang datar. Tidak ada panduan rute visual.</w:t>
-            </w:r>
-          </w:p>
-          <w:p>
-            <w:pPr>
+            <w:pPr>
+              <w:spacing w:after="30" w:before="20" w:line="230"/>
+            </w:pPr>
+            <w:r>
+              <w:rPr>
+                <w:rFonts w:ascii="Times New Roman" w:cs="Times New Roman" w:eastAsia="Times New Roman" w:hAnsi="Times New Roman"/>
+                <w:sz w:val="19"/>
+                <w:szCs w:val="19"/>
+              </w:rPr>
+              <w:t xml:space="preserve">• Formulir konvensional dengan kontras rendah.</w:t>
+            </w:r>
+          </w:p>
+          <w:p>
+            <w:pPr>
+              <w:spacing w:after="30" w:before="20" w:line="230"/>
+            </w:pPr>
+            <w:r>
+              <w:rPr>
+                <w:rFonts w:ascii="Times New Roman" w:cs="Times New Roman" w:eastAsia="Times New Roman" w:hAnsi="Times New Roman"/>
+                <w:sz w:val="19"/>
+                <w:szCs w:val="19"/>
+              </w:rPr>
+              <w:t xml:space="preserve">• Tidak tersedia panduan visual rute.</w:t>
+            </w:r>
+          </w:p>
+          <w:p>
+            <w:pPr>
+              <w:spacing w:after="40" w:before="40"/>
               <w:jc w:val="center"/>
             </w:pPr>
             <w:r>
               <w:drawing>
                 <wp:inline distT="0" distB="0" distL="0" distR="0">
-                  <wp:extent cx="1905000" cy="1047750"/>
+                  <wp:extent cx="1809750" cy="1000125"/>
                   <wp:effectExtent t="0" r="0" b="0" l="0"/>
                   <wp:docPr id="1" name="" descr="" title=""/>
                   <wp:cNvGraphicFramePr>
@@ -936,7 +968,7 @@
                         <pic:spPr bwMode="auto">
                           <a:xfrm>
                             <a:off x="0" y="0"/>
-                            <a:ext cx="1905000" cy="1047750"/>
+                            <a:ext cx="1809750" cy="1000125"/>
                           </a:xfrm>
                           <a:prstGeom prst="rect">
                             <a:avLst/>
@@ -952,18 +984,40 @@
         </w:tc>
         <w:tc>
           <w:p>
-            <w:r>
-              <w:t xml:space="preserve">Formulir modern dengan kontras tinggi (Navy-Oranye KAI), tombol swap stasiun 1-klik, dan tombol 'Pilih Rute via Peta'.</w:t>
-            </w:r>
-          </w:p>
-          <w:p>
-            <w:pPr>
+            <w:pPr>
+              <w:spacing w:after="30" w:before="20" w:line="230"/>
+            </w:pPr>
+            <w:r>
+              <w:rPr>
+                <w:rFonts w:ascii="Times New Roman" w:cs="Times New Roman" w:eastAsia="Times New Roman" w:hAnsi="Times New Roman"/>
+                <w:sz w:val="19"/>
+                <w:szCs w:val="19"/>
+              </w:rPr>
+              <w:t xml:space="preserve">• Search Card modern dengan kontras tinggi (Navy-Oranye KAI).</w:t>
+            </w:r>
+          </w:p>
+          <w:p>
+            <w:pPr>
+              <w:spacing w:after="30" w:before="20" w:line="230"/>
+            </w:pPr>
+            <w:r>
+              <w:rPr>
+                <w:rFonts w:ascii="Times New Roman" w:cs="Times New Roman" w:eastAsia="Times New Roman" w:hAnsi="Times New Roman"/>
+                <w:sz w:val="19"/>
+                <w:szCs w:val="19"/>
+              </w:rPr>
+              <w:t xml:space="preserve">• Tombol swap stasiun 1-klik &amp; opsi 'Pilih Rute via Peta'.</w:t>
+            </w:r>
+          </w:p>
+          <w:p>
+            <w:pPr>
+              <w:spacing w:after="40" w:before="40"/>
               <w:jc w:val="center"/>
             </w:pPr>
             <w:r>
               <w:drawing>
                 <wp:inline distT="0" distB="0" distL="0" distR="0">
-                  <wp:extent cx="1905000" cy="1047750"/>
+                  <wp:extent cx="1809750" cy="1000125"/>
                   <wp:effectExtent t="0" r="0" b="0" l="0"/>
                   <wp:docPr id="1" name="" descr="" title=""/>
                   <wp:cNvGraphicFramePr>
@@ -988,7 +1042,7 @@
                         <pic:spPr bwMode="auto">
                           <a:xfrm>
                             <a:off x="0" y="0"/>
-                            <a:ext cx="1905000" cy="1047750"/>
+                            <a:ext cx="1809750" cy="1000125"/>
                           </a:xfrm>
                           <a:prstGeom prst="rect">
                             <a:avLst/>
@@ -1004,8 +1058,29 @@
         </w:tc>
         <w:tc>
           <w:p>
-            <w:r>
-              <w:t xml:space="preserve">Aesthetic and Minimalist Design &amp; Error Prevention. Mengurangi beban kognitif saat perumusan kueri.</w:t>
+            <w:pPr>
+              <w:spacing w:after="30" w:before="20" w:line="230"/>
+            </w:pPr>
+            <w:r>
+              <w:rPr>
+                <w:rFonts w:ascii="Times New Roman" w:cs="Times New Roman" w:eastAsia="Times New Roman" w:hAnsi="Times New Roman"/>
+                <w:sz w:val="19"/>
+                <w:szCs w:val="19"/>
+              </w:rPr>
+              <w:t xml:space="preserve">• Aesthetic &amp; Minimalist Design.</w:t>
+            </w:r>
+          </w:p>
+          <w:p>
+            <w:pPr>
+              <w:spacing w:after="30" w:before="20" w:line="230"/>
+            </w:pPr>
+            <w:r>
+              <w:rPr>
+                <w:rFonts w:ascii="Times New Roman" w:cs="Times New Roman" w:eastAsia="Times New Roman" w:hAnsi="Times New Roman"/>
+                <w:sz w:val="19"/>
+                <w:szCs w:val="19"/>
+              </w:rPr>
+              <w:t xml:space="preserve">• Error Prevention (meminimalkan salah input).</w:t>
             </w:r>
           </w:p>
         </w:tc>
@@ -1017,6 +1092,8 @@
               <w:rPr>
                 <w:b/>
                 <w:bCs/>
+                <w:sz w:val="20"/>
+                <w:szCs w:val="20"/>
               </w:rPr>
               <w:t xml:space="preserve">2. Search Suggestion / Autocomplete</w:t>
             </w:r>
@@ -1024,18 +1101,40 @@
         </w:tc>
         <w:tc>
           <w:p>
-            <w:r>
-              <w:t xml:space="preserve">Dropdown teks sederhana tanpa rekomendasi stasiun populer di awal. Pengguna harus hafal nama stasiun.</w:t>
-            </w:r>
-          </w:p>
-          <w:p>
-            <w:pPr>
+            <w:pPr>
+              <w:spacing w:after="30" w:before="20" w:line="230"/>
+            </w:pPr>
+            <w:r>
+              <w:rPr>
+                <w:rFonts w:ascii="Times New Roman" w:cs="Times New Roman" w:eastAsia="Times New Roman" w:hAnsi="Times New Roman"/>
+                <w:sz w:val="19"/>
+                <w:szCs w:val="19"/>
+              </w:rPr>
+              <w:t xml:space="preserve">• Dropdown teks standar tanpa saran awal.</w:t>
+            </w:r>
+          </w:p>
+          <w:p>
+            <w:pPr>
+              <w:spacing w:after="30" w:before="20" w:line="230"/>
+            </w:pPr>
+            <w:r>
+              <w:rPr>
+                <w:rFonts w:ascii="Times New Roman" w:cs="Times New Roman" w:eastAsia="Times New Roman" w:hAnsi="Times New Roman"/>
+                <w:sz w:val="19"/>
+                <w:szCs w:val="19"/>
+              </w:rPr>
+              <w:t xml:space="preserve">• Pengguna wajib hafal nama lengkap stasiun.</w:t>
+            </w:r>
+          </w:p>
+          <w:p>
+            <w:pPr>
+              <w:spacing w:after="40" w:before="40"/>
               <w:jc w:val="center"/>
             </w:pPr>
             <w:r>
               <w:drawing>
                 <wp:inline distT="0" distB="0" distL="0" distR="0">
-                  <wp:extent cx="1905000" cy="1047750"/>
+                  <wp:extent cx="1809750" cy="1000125"/>
                   <wp:effectExtent t="0" r="0" b="0" l="0"/>
                   <wp:docPr id="1" name="" descr="" title=""/>
                   <wp:cNvGraphicFramePr>
@@ -1060,7 +1159,7 @@
                         <pic:spPr bwMode="auto">
                           <a:xfrm>
                             <a:off x="0" y="0"/>
-                            <a:ext cx="1905000" cy="1047750"/>
+                            <a:ext cx="1809750" cy="1000125"/>
                           </a:xfrm>
                           <a:prstGeom prst="rect">
                             <a:avLst/>
@@ -1076,18 +1175,40 @@
         </w:tc>
         <w:tc>
           <w:p>
-            <w:r>
-              <w:t xml:space="preserve">Smart Suggestion Modal dengan daftar 'Stasiun Populer', pencarian berbasis kota, dan lencana kode stasiun KAI 3 huruf.</w:t>
-            </w:r>
-          </w:p>
-          <w:p>
-            <w:pPr>
+            <w:pPr>
+              <w:spacing w:after="30" w:before="20" w:line="230"/>
+            </w:pPr>
+            <w:r>
+              <w:rPr>
+                <w:rFonts w:ascii="Times New Roman" w:cs="Times New Roman" w:eastAsia="Times New Roman" w:hAnsi="Times New Roman"/>
+                <w:sz w:val="19"/>
+                <w:szCs w:val="19"/>
+              </w:rPr>
+              <w:t xml:space="preserve">• Smart Modal dengan daftar 'Stasiun Populer'.</w:t>
+            </w:r>
+          </w:p>
+          <w:p>
+            <w:pPr>
+              <w:spacing w:after="30" w:before="20" w:line="230"/>
+            </w:pPr>
+            <w:r>
+              <w:rPr>
+                <w:rFonts w:ascii="Times New Roman" w:cs="Times New Roman" w:eastAsia="Times New Roman" w:hAnsi="Times New Roman"/>
+                <w:sz w:val="19"/>
+                <w:szCs w:val="19"/>
+              </w:rPr>
+              <w:t xml:space="preserve">• Mendukung pencarian nama kota maupun kode 3 huruf (GMR, YK, BDO).</w:t>
+            </w:r>
+          </w:p>
+          <w:p>
+            <w:pPr>
+              <w:spacing w:after="40" w:before="40"/>
               <w:jc w:val="center"/>
             </w:pPr>
             <w:r>
               <w:drawing>
                 <wp:inline distT="0" distB="0" distL="0" distR="0">
-                  <wp:extent cx="1905000" cy="1047750"/>
+                  <wp:extent cx="1809750" cy="1000125"/>
                   <wp:effectExtent t="0" r="0" b="0" l="0"/>
                   <wp:docPr id="1" name="" descr="" title=""/>
                   <wp:cNvGraphicFramePr>
@@ -1112,7 +1233,7 @@
                         <pic:spPr bwMode="auto">
                           <a:xfrm>
                             <a:off x="0" y="0"/>
-                            <a:ext cx="1905000" cy="1047750"/>
+                            <a:ext cx="1809750" cy="1000125"/>
                           </a:xfrm>
                           <a:prstGeom prst="rect">
                             <a:avLst/>
@@ -1128,8 +1249,16 @@
         </w:tc>
         <w:tc>
           <w:p>
-            <w:r>
-              <w:t xml:space="preserve">Recognition rather than Recall (Nielsen #6). Pengguna cukup mengenali stasiun tanpa perlu mengingat kodenya.</w:t>
+            <w:pPr>
+              <w:spacing w:after="30" w:before="20" w:line="230"/>
+            </w:pPr>
+            <w:r>
+              <w:rPr>
+                <w:rFonts w:ascii="Times New Roman" w:cs="Times New Roman" w:eastAsia="Times New Roman" w:hAnsi="Times New Roman"/>
+                <w:sz w:val="19"/>
+                <w:szCs w:val="19"/>
+              </w:rPr>
+              <w:t xml:space="preserve">• Recognition rather than Recall (Nielsen #6).</w:t>
             </w:r>
           </w:p>
         </w:tc>
@@ -1141,6 +1270,8 @@
               <w:rPr>
                 <w:b/>
                 <w:bCs/>
+                <w:sz w:val="20"/>
+                <w:szCs w:val="20"/>
               </w:rPr>
               <w:t xml:space="preserve">3. Search Result</w:t>
             </w:r>
@@ -1148,18 +1279,40 @@
         </w:tc>
         <w:tc>
           <w:p>
-            <w:r>
-              <w:t xml:space="preserve">Daftar kereta statis memanjang ke bawah dengan tombol PESAN terpisah per subkelas tarif; tidak menampilkan perbandingan harga lintas tanggal.</w:t>
-            </w:r>
-          </w:p>
-          <w:p>
-            <w:pPr>
+            <w:pPr>
+              <w:spacing w:after="30" w:before="20" w:line="230"/>
+            </w:pPr>
+            <w:r>
+              <w:rPr>
+                <w:rFonts w:ascii="Times New Roman" w:cs="Times New Roman" w:eastAsia="Times New Roman" w:hAnsi="Times New Roman"/>
+                <w:sz w:val="19"/>
+                <w:szCs w:val="19"/>
+              </w:rPr>
+              <w:t xml:space="preserve">• Daftar jadwal statis memanjang ke bawah.</w:t>
+            </w:r>
+          </w:p>
+          <w:p>
+            <w:pPr>
+              <w:spacing w:after="30" w:before="20" w:line="230"/>
+            </w:pPr>
+            <w:r>
+              <w:rPr>
+                <w:rFonts w:ascii="Times New Roman" w:cs="Times New Roman" w:eastAsia="Times New Roman" w:hAnsi="Times New Roman"/>
+                <w:sz w:val="19"/>
+                <w:szCs w:val="19"/>
+              </w:rPr>
+              <w:t xml:space="preserve">• Tidak ada perbandingan harga lintas tanggal.</w:t>
+            </w:r>
+          </w:p>
+          <w:p>
+            <w:pPr>
+              <w:spacing w:after="40" w:before="40"/>
               <w:jc w:val="center"/>
             </w:pPr>
             <w:r>
               <w:drawing>
                 <wp:inline distT="0" distB="0" distL="0" distR="0">
-                  <wp:extent cx="1905000" cy="1047750"/>
+                  <wp:extent cx="1809750" cy="1000125"/>
                   <wp:effectExtent t="0" r="0" b="0" l="0"/>
                   <wp:docPr id="1" name="" descr="" title=""/>
                   <wp:cNvGraphicFramePr>
@@ -1184,7 +1337,7 @@
                         <pic:spPr bwMode="auto">
                           <a:xfrm>
                             <a:off x="0" y="0"/>
-                            <a:ext cx="1905000" cy="1047750"/>
+                            <a:ext cx="1809750" cy="1000125"/>
                           </a:xfrm>
                           <a:prstGeom prst="rect">
                             <a:avLst/>
@@ -1200,18 +1353,40 @@
         </w:tc>
         <w:tc>
           <w:p>
-            <w:r>
-              <w:t xml:space="preserve">Matriks hasil pencarian kereta interaktif (Jam x Kelas) dilengkapi Date Strip Carousel untuk perbandingan tarif termurah antartanggal.</w:t>
-            </w:r>
-          </w:p>
-          <w:p>
-            <w:pPr>
+            <w:pPr>
+              <w:spacing w:after="30" w:before="20" w:line="230"/>
+            </w:pPr>
+            <w:r>
+              <w:rPr>
+                <w:rFonts w:ascii="Times New Roman" w:cs="Times New Roman" w:eastAsia="Times New Roman" w:hAnsi="Times New Roman"/>
+                <w:sz w:val="19"/>
+                <w:szCs w:val="19"/>
+              </w:rPr>
+              <w:t xml:space="preserve">• Kartu kereta terstruktur (jam, durasi, kelas, harga).</w:t>
+            </w:r>
+          </w:p>
+          <w:p>
+            <w:pPr>
+              <w:spacing w:after="30" w:before="20" w:line="230"/>
+            </w:pPr>
+            <w:r>
+              <w:rPr>
+                <w:rFonts w:ascii="Times New Roman" w:cs="Times New Roman" w:eastAsia="Times New Roman" w:hAnsi="Times New Roman"/>
+                <w:sz w:val="19"/>
+                <w:szCs w:val="19"/>
+              </w:rPr>
+              <w:t xml:space="preserve">• Date Strip Carousel untuk komparasi tarif H-3 s.d. H+3 dalam 1 klik.</w:t>
+            </w:r>
+          </w:p>
+          <w:p>
+            <w:pPr>
+              <w:spacing w:after="40" w:before="40"/>
               <w:jc w:val="center"/>
             </w:pPr>
             <w:r>
               <w:drawing>
                 <wp:inline distT="0" distB="0" distL="0" distR="0">
-                  <wp:extent cx="1905000" cy="1047750"/>
+                  <wp:extent cx="1809750" cy="1000125"/>
                   <wp:effectExtent t="0" r="0" b="0" l="0"/>
                   <wp:docPr id="1" name="" descr="" title=""/>
                   <wp:cNvGraphicFramePr>
@@ -1236,7 +1411,7 @@
                         <pic:spPr bwMode="auto">
                           <a:xfrm>
                             <a:off x="0" y="0"/>
-                            <a:ext cx="1905000" cy="1047750"/>
+                            <a:ext cx="1809750" cy="1000125"/>
                           </a:xfrm>
                           <a:prstGeom prst="rect">
                             <a:avLst/>
@@ -1252,8 +1427,16 @@
         </w:tc>
         <w:tc>
           <w:p>
-            <w:r>
-              <w:t xml:space="preserve">Flexibility &amp; Efficiency of Use. Pengguna dapat membandingkan jadwal dan tarif antartanggal dalam 1 kali pandang.</w:t>
+            <w:pPr>
+              <w:spacing w:after="30" w:before="20" w:line="230"/>
+            </w:pPr>
+            <w:r>
+              <w:rPr>
+                <w:rFonts w:ascii="Times New Roman" w:cs="Times New Roman" w:eastAsia="Times New Roman" w:hAnsi="Times New Roman"/>
+                <w:sz w:val="19"/>
+                <w:szCs w:val="19"/>
+              </w:rPr>
+              <w:t xml:space="preserve">• Flexibility &amp; Efficiency of Use (Nielsen #7).</w:t>
             </w:r>
           </w:p>
         </w:tc>
@@ -1265,6 +1448,8 @@
               <w:rPr>
                 <w:b/>
                 <w:bCs/>
+                <w:sz w:val="20"/>
+                <w:szCs w:val="20"/>
               </w:rPr>
               <w:t xml:space="preserve">4. Filter</w:t>
             </w:r>
@@ -1272,18 +1457,40 @@
         </w:tc>
         <w:tc>
           <w:p>
-            <w:r>
-              <w:t xml:space="preserve">Tidak tersedia panel filter kategori komprehensif; opsi penyaringan harga tersembunyi di balik tombol toggle dan tidak ada filter waktu/kelas.</w:t>
-            </w:r>
-          </w:p>
-          <w:p>
-            <w:pPr>
+            <w:pPr>
+              <w:spacing w:after="30" w:before="20" w:line="230"/>
+            </w:pPr>
+            <w:r>
+              <w:rPr>
+                <w:rFonts w:ascii="Times New Roman" w:cs="Times New Roman" w:eastAsia="Times New Roman" w:hAnsi="Times New Roman"/>
+                <w:sz w:val="19"/>
+                <w:szCs w:val="19"/>
+              </w:rPr>
+              <w:t xml:space="preserve">• Tidak ada filter kategori langsung di halaman hasil.</w:t>
+            </w:r>
+          </w:p>
+          <w:p>
+            <w:pPr>
+              <w:spacing w:after="30" w:before="20" w:line="230"/>
+            </w:pPr>
+            <w:r>
+              <w:rPr>
+                <w:rFonts w:ascii="Times New Roman" w:cs="Times New Roman" w:eastAsia="Times New Roman" w:hAnsi="Times New Roman"/>
+                <w:sz w:val="19"/>
+                <w:szCs w:val="19"/>
+              </w:rPr>
+              <w:t xml:space="preserve">• Pilihan filter kaku dan tersembunyi.</w:t>
+            </w:r>
+          </w:p>
+          <w:p>
+            <w:pPr>
+              <w:spacing w:after="40" w:before="40"/>
               <w:jc w:val="center"/>
             </w:pPr>
             <w:r>
               <w:drawing>
                 <wp:inline distT="0" distB="0" distL="0" distR="0">
-                  <wp:extent cx="1905000" cy="1047750"/>
+                  <wp:extent cx="1809750" cy="1000125"/>
                   <wp:effectExtent t="0" r="0" b="0" l="0"/>
                   <wp:docPr id="1" name="" descr="" title=""/>
                   <wp:cNvGraphicFramePr>
@@ -1308,7 +1515,7 @@
                         <pic:spPr bwMode="auto">
                           <a:xfrm>
                             <a:off x="0" y="0"/>
-                            <a:ext cx="1905000" cy="1047750"/>
+                            <a:ext cx="1809750" cy="1000125"/>
                           </a:xfrm>
                           <a:prstGeom prst="rect">
                             <a:avLst/>
@@ -1324,18 +1531,40 @@
         </w:tc>
         <w:tc>
           <w:p>
-            <w:r>
-              <w:t xml:space="preserve">Toolbar Filter Dropdown berlatar biru primary (KAI Blue) di atas hasil pencarian. Pengguna dapat menyaring Kelas (Eksekutif, Bisnis, Ekonomi) dan Waktu Keberangkatan via menu dropdown interaktif dengan pembaruan instan serta tombol Reset otomatis.</w:t>
-            </w:r>
-          </w:p>
-          <w:p>
-            <w:pPr>
+            <w:pPr>
+              <w:spacing w:after="30" w:before="20" w:line="230"/>
+            </w:pPr>
+            <w:r>
+              <w:rPr>
+                <w:rFonts w:ascii="Times New Roman" w:cs="Times New Roman" w:eastAsia="Times New Roman" w:hAnsi="Times New Roman"/>
+                <w:sz w:val="19"/>
+                <w:szCs w:val="19"/>
+              </w:rPr>
+              <w:t xml:space="preserve">• Toolbar Filter Dropdown berlatar biru primary KAI.</w:t>
+            </w:r>
+          </w:p>
+          <w:p>
+            <w:pPr>
+              <w:spacing w:after="30" w:before="20" w:line="230"/>
+            </w:pPr>
+            <w:r>
+              <w:rPr>
+                <w:rFonts w:ascii="Times New Roman" w:cs="Times New Roman" w:eastAsia="Times New Roman" w:hAnsi="Times New Roman"/>
+                <w:sz w:val="19"/>
+                <w:szCs w:val="19"/>
+              </w:rPr>
+              <w:t xml:space="preserve">• Filter Kelas dan Jam dengan tombol Reset otomatis.</w:t>
+            </w:r>
+          </w:p>
+          <w:p>
+            <w:pPr>
+              <w:spacing w:after="40" w:before="40"/>
               <w:jc w:val="center"/>
             </w:pPr>
             <w:r>
               <w:drawing>
                 <wp:inline distT="0" distB="0" distL="0" distR="0">
-                  <wp:extent cx="1905000" cy="1047750"/>
+                  <wp:extent cx="1809750" cy="1000125"/>
                   <wp:effectExtent t="0" r="0" b="0" l="0"/>
                   <wp:docPr id="1" name="" descr="" title=""/>
                   <wp:cNvGraphicFramePr>
@@ -1360,7 +1589,7 @@
                         <pic:spPr bwMode="auto">
                           <a:xfrm>
                             <a:off x="0" y="0"/>
-                            <a:ext cx="1905000" cy="1047750"/>
+                            <a:ext cx="1809750" cy="1000125"/>
                           </a:xfrm>
                           <a:prstGeom prst="rect">
                             <a:avLst/>
@@ -1376,8 +1605,16 @@
         </w:tc>
         <w:tc>
           <w:p>
-            <w:r>
-              <w:t xml:space="preserve">Direct Manipulation &amp; Immediate Feedback (Shneiderman). Hasil tersaring seketika tanpa reload halaman.</w:t>
+            <w:pPr>
+              <w:spacing w:after="30" w:before="20" w:line="230"/>
+            </w:pPr>
+            <w:r>
+              <w:rPr>
+                <w:rFonts w:ascii="Times New Roman" w:cs="Times New Roman" w:eastAsia="Times New Roman" w:hAnsi="Times New Roman"/>
+                <w:sz w:val="19"/>
+                <w:szCs w:val="19"/>
+              </w:rPr>
+              <w:t xml:space="preserve">• Direct Manipulation &amp; Immediate Feedback (Shneiderman).</w:t>
             </w:r>
           </w:p>
         </w:tc>
@@ -1389,6 +1626,8 @@
               <w:rPr>
                 <w:b/>
                 <w:bCs/>
+                <w:sz w:val="20"/>
+                <w:szCs w:val="20"/>
               </w:rPr>
               <w:t xml:space="preserve">5. Sorting</w:t>
             </w:r>
@@ -1396,18 +1635,27 @@
         </w:tc>
         <w:tc>
           <w:p>
-            <w:r>
-              <w:t xml:space="preserve">Tombol urutan datar statis [Kelas][Stasiun][Kereta][Waktu][Harga] tanpa indikator jelas apakah urutan menaik (asc) atau menurun (desc).</w:t>
-            </w:r>
-          </w:p>
-          <w:p>
-            <w:pPr>
+            <w:pPr>
+              <w:spacing w:after="30" w:before="20" w:line="230"/>
+            </w:pPr>
+            <w:r>
+              <w:rPr>
+                <w:rFonts w:ascii="Times New Roman" w:cs="Times New Roman" w:eastAsia="Times New Roman" w:hAnsi="Times New Roman"/>
+                <w:sz w:val="19"/>
+                <w:szCs w:val="19"/>
+              </w:rPr>
+              <w:t xml:space="preserve">• Tombol sorting statis tanpa arah urutan jelas.</w:t>
+            </w:r>
+          </w:p>
+          <w:p>
+            <w:pPr>
+              <w:spacing w:after="40" w:before="40"/>
               <w:jc w:val="center"/>
             </w:pPr>
             <w:r>
               <w:drawing>
                 <wp:inline distT="0" distB="0" distL="0" distR="0">
-                  <wp:extent cx="1905000" cy="1047750"/>
+                  <wp:extent cx="1809750" cy="1000125"/>
                   <wp:effectExtent t="0" r="0" b="0" l="0"/>
                   <wp:docPr id="1" name="" descr="" title=""/>
                   <wp:cNvGraphicFramePr>
@@ -1432,7 +1680,7 @@
                         <pic:spPr bwMode="auto">
                           <a:xfrm>
                             <a:off x="0" y="0"/>
-                            <a:ext cx="1905000" cy="1047750"/>
+                            <a:ext cx="1809750" cy="1000125"/>
                           </a:xfrm>
                           <a:prstGeom prst="rect">
                             <a:avLst/>
@@ -1448,18 +1696,40 @@
         </w:tc>
         <w:tc>
           <w:p>
-            <w:r>
-              <w:t xml:space="preserve">Dropdown sorting dinamis: Harga Paling Murah (kereta termurah langsung tampil di posisi teratas), Waktu Berangkat, dan Durasi Tercepat.</w:t>
-            </w:r>
-          </w:p>
-          <w:p>
-            <w:pPr>
+            <w:pPr>
+              <w:spacing w:after="30" w:before="20" w:line="230"/>
+            </w:pPr>
+            <w:r>
+              <w:rPr>
+                <w:rFonts w:ascii="Times New Roman" w:cs="Times New Roman" w:eastAsia="Times New Roman" w:hAnsi="Times New Roman"/>
+                <w:sz w:val="19"/>
+                <w:szCs w:val="19"/>
+              </w:rPr>
+              <w:t xml:space="preserve">• Menu Dropdown Sorting (Harga Termurah, Waktu, Durasi).</w:t>
+            </w:r>
+          </w:p>
+          <w:p>
+            <w:pPr>
+              <w:spacing w:after="30" w:before="20" w:line="230"/>
+            </w:pPr>
+            <w:r>
+              <w:rPr>
+                <w:rFonts w:ascii="Times New Roman" w:cs="Times New Roman" w:eastAsia="Times New Roman" w:hAnsi="Times New Roman"/>
+                <w:sz w:val="19"/>
+                <w:szCs w:val="19"/>
+              </w:rPr>
+              <w:t xml:space="preserve">• Pembaruan urutan instan tanpa reload halaman.</w:t>
+            </w:r>
+          </w:p>
+          <w:p>
+            <w:pPr>
+              <w:spacing w:after="40" w:before="40"/>
               <w:jc w:val="center"/>
             </w:pPr>
             <w:r>
               <w:drawing>
                 <wp:inline distT="0" distB="0" distL="0" distR="0">
-                  <wp:extent cx="1905000" cy="1047750"/>
+                  <wp:extent cx="1809750" cy="1000125"/>
                   <wp:effectExtent t="0" r="0" b="0" l="0"/>
                   <wp:docPr id="1" name="" descr="" title=""/>
                   <wp:cNvGraphicFramePr>
@@ -1484,7 +1754,7 @@
                         <pic:spPr bwMode="auto">
                           <a:xfrm>
                             <a:off x="0" y="0"/>
-                            <a:ext cx="1905000" cy="1047750"/>
+                            <a:ext cx="1809750" cy="1000125"/>
                           </a:xfrm>
                           <a:prstGeom prst="rect">
                             <a:avLst/>
@@ -1500,8 +1770,16 @@
         </w:tc>
         <w:tc>
           <w:p>
-            <w:r>
-              <w:t xml:space="preserve">User Control and Freedom (Nielsen #3). Memberikan kendali penuh pada prioritas efisiensi biaya dan waktu pengguna.</w:t>
+            <w:pPr>
+              <w:spacing w:after="30" w:before="20" w:line="230"/>
+            </w:pPr>
+            <w:r>
+              <w:rPr>
+                <w:rFonts w:ascii="Times New Roman" w:cs="Times New Roman" w:eastAsia="Times New Roman" w:hAnsi="Times New Roman"/>
+                <w:sz w:val="19"/>
+                <w:szCs w:val="19"/>
+              </w:rPr>
+              <w:t xml:space="preserve">• User Control and Freedom (Nielsen #3).</w:t>
             </w:r>
           </w:p>
         </w:tc>
@@ -1513,6 +1791,8 @@
               <w:rPr>
                 <w:b/>
                 <w:bCs/>
+                <w:sz w:val="20"/>
+                <w:szCs w:val="20"/>
               </w:rPr>
               <w:t xml:space="preserve">6. Navigasi Menemukan Informasi</w:t>
             </w:r>
@@ -1520,18 +1800,40 @@
         </w:tc>
         <w:tc>
           <w:p>
-            <w:r>
-              <w:t xml:space="preserve">Hanya berbasis formulir teks linier statis; pengguna yang tidak hafal letak geografis stasiun kebingungan menentukan stasiun terdekat.</w:t>
-            </w:r>
-          </w:p>
-          <w:p>
-            <w:pPr>
+            <w:pPr>
+              <w:spacing w:after="30" w:before="20" w:line="230"/>
+            </w:pPr>
+            <w:r>
+              <w:rPr>
+                <w:rFonts w:ascii="Times New Roman" w:cs="Times New Roman" w:eastAsia="Times New Roman" w:hAnsi="Times New Roman"/>
+                <w:sz w:val="19"/>
+                <w:szCs w:val="19"/>
+              </w:rPr>
+              <w:t xml:space="preserve">• Hanya berbasis input formulir teks linier.</w:t>
+            </w:r>
+          </w:p>
+          <w:p>
+            <w:pPr>
+              <w:spacing w:after="30" w:before="20" w:line="230"/>
+            </w:pPr>
+            <w:r>
+              <w:rPr>
+                <w:rFonts w:ascii="Times New Roman" w:cs="Times New Roman" w:eastAsia="Times New Roman" w:hAnsi="Times New Roman"/>
+                <w:sz w:val="19"/>
+                <w:szCs w:val="19"/>
+              </w:rPr>
+              <w:t xml:space="preserve">• Sulit bagi pengguna yang belum hafal letak stasiun.</w:t>
+            </w:r>
+          </w:p>
+          <w:p>
+            <w:pPr>
+              <w:spacing w:after="40" w:before="40"/>
               <w:jc w:val="center"/>
             </w:pPr>
             <w:r>
               <w:drawing>
                 <wp:inline distT="0" distB="0" distL="0" distR="0">
-                  <wp:extent cx="1905000" cy="1047750"/>
+                  <wp:extent cx="1809750" cy="1000125"/>
                   <wp:effectExtent t="0" r="0" b="0" l="0"/>
                   <wp:docPr id="1" name="" descr="" title=""/>
                   <wp:cNvGraphicFramePr>
@@ -1556,7 +1858,7 @@
                         <pic:spPr bwMode="auto">
                           <a:xfrm>
                             <a:off x="0" y="0"/>
-                            <a:ext cx="1905000" cy="1047750"/>
+                            <a:ext cx="1809750" cy="1000125"/>
                           </a:xfrm>
                           <a:prstGeom prst="rect">
                             <a:avLst/>
@@ -1572,18 +1874,40 @@
         </w:tc>
         <w:tc>
           <w:p>
-            <w:r>
-              <w:t xml:space="preserve">Peta Rute Spasial Interaktif (/peta-rute); stasiun dapat diklik langsung di peta dan jalur rel kereta menyala oranye presisi.</w:t>
-            </w:r>
-          </w:p>
-          <w:p>
-            <w:pPr>
+            <w:pPr>
+              <w:spacing w:after="30" w:before="20" w:line="230"/>
+            </w:pPr>
+            <w:r>
+              <w:rPr>
+                <w:rFonts w:ascii="Times New Roman" w:cs="Times New Roman" w:eastAsia="Times New Roman" w:hAnsi="Times New Roman"/>
+                <w:sz w:val="19"/>
+                <w:szCs w:val="19"/>
+              </w:rPr>
+              <w:t xml:space="preserve">• Peta Rute Interaktif Pulau Jawa (/peta-rute).</w:t>
+            </w:r>
+          </w:p>
+          <w:p>
+            <w:pPr>
+              <w:spacing w:after="30" w:before="20" w:line="230"/>
+            </w:pPr>
+            <w:r>
+              <w:rPr>
+                <w:rFonts w:ascii="Times New Roman" w:cs="Times New Roman" w:eastAsia="Times New Roman" w:hAnsi="Times New Roman"/>
+                <w:sz w:val="19"/>
+                <w:szCs w:val="19"/>
+              </w:rPr>
+              <w:t xml:space="preserve">• Stasiun dapat diklik langsung dengan visual rel oranye.</w:t>
+            </w:r>
+          </w:p>
+          <w:p>
+            <w:pPr>
+              <w:spacing w:after="40" w:before="40"/>
               <w:jc w:val="center"/>
             </w:pPr>
             <w:r>
               <w:drawing>
                 <wp:inline distT="0" distB="0" distL="0" distR="0">
-                  <wp:extent cx="1905000" cy="1047750"/>
+                  <wp:extent cx="1809750" cy="1000125"/>
                   <wp:effectExtent t="0" r="0" b="0" l="0"/>
                   <wp:docPr id="1" name="" descr="" title=""/>
                   <wp:cNvGraphicFramePr>
@@ -1608,7 +1932,7 @@
                         <pic:spPr bwMode="auto">
                           <a:xfrm>
                             <a:off x="0" y="0"/>
-                            <a:ext cx="1905000" cy="1047750"/>
+                            <a:ext cx="1809750" cy="1000125"/>
                           </a:xfrm>
                           <a:prstGeom prst="rect">
                             <a:avLst/>
@@ -1624,8 +1948,16 @@
         </w:tc>
         <w:tc>
           <w:p>
-            <w:r>
-              <w:t xml:space="preserve">Match between System and Real World (Nielsen #2). Membentuk model mental geografis yang konkret dan intuitif.</w:t>
+            <w:pPr>
+              <w:spacing w:after="30" w:before="20" w:line="230"/>
+            </w:pPr>
+            <w:r>
+              <w:rPr>
+                <w:rFonts w:ascii="Times New Roman" w:cs="Times New Roman" w:eastAsia="Times New Roman" w:hAnsi="Times New Roman"/>
+                <w:sz w:val="19"/>
+                <w:szCs w:val="19"/>
+              </w:rPr>
+              <w:t xml:space="preserve">• Match between System and Real World (Nielsen #2).</w:t>
             </w:r>
           </w:p>
         </w:tc>
@@ -1637,6 +1969,8 @@
               <w:rPr>
                 <w:b/>
                 <w:bCs/>
+                <w:sz w:val="20"/>
+                <w:szCs w:val="20"/>
               </w:rPr>
               <w:t xml:space="preserve">7. No-Result / Error / Feedback</w:t>
             </w:r>
@@ -1644,18 +1978,27 @@
         </w:tc>
         <w:tc>
           <w:p>
-            <w:r>
-              <w:t xml:space="preserve">Feedback eror berupa notifikasi toast merah kecil di pojok kanan bawah yang mudah terlewat dan tanpa panduan solutif.</w:t>
-            </w:r>
-          </w:p>
-          <w:p>
-            <w:pPr>
+            <w:pPr>
+              <w:spacing w:after="30" w:before="20" w:line="230"/>
+            </w:pPr>
+            <w:r>
+              <w:rPr>
+                <w:rFonts w:ascii="Times New Roman" w:cs="Times New Roman" w:eastAsia="Times New Roman" w:hAnsi="Times New Roman"/>
+                <w:sz w:val="19"/>
+                <w:szCs w:val="19"/>
+              </w:rPr>
+              <w:t xml:space="preserve">• Notifikasi error kecil di pojok layar tanpa solusi.</w:t>
+            </w:r>
+          </w:p>
+          <w:p>
+            <w:pPr>
+              <w:spacing w:after="40" w:before="40"/>
               <w:jc w:val="center"/>
             </w:pPr>
             <w:r>
               <w:drawing>
                 <wp:inline distT="0" distB="0" distL="0" distR="0">
-                  <wp:extent cx="1905000" cy="1047750"/>
+                  <wp:extent cx="1809750" cy="1000125"/>
                   <wp:effectExtent t="0" r="0" b="0" l="0"/>
                   <wp:docPr id="1" name="" descr="" title=""/>
                   <wp:cNvGraphicFramePr>
@@ -1680,7 +2023,7 @@
                         <pic:spPr bwMode="auto">
                           <a:xfrm>
                             <a:off x="0" y="0"/>
-                            <a:ext cx="1905000" cy="1047750"/>
+                            <a:ext cx="1809750" cy="1000125"/>
                           </a:xfrm>
                           <a:prstGeom prst="rect">
                             <a:avLst/>
@@ -1696,18 +2039,40 @@
         </w:tc>
         <w:tc>
           <w:p>
-            <w:r>
-              <w:t xml:space="preserve">Empty State empatik berpusat di layar dengan ilustrasi Maskot KAI ramah serta tombol aksi solutif: 'Reset Semua Filter' dan 'Cek di Peta Rute'.</w:t>
-            </w:r>
-          </w:p>
-          <w:p>
-            <w:pPr>
+            <w:pPr>
+              <w:spacing w:after="30" w:before="20" w:line="230"/>
+            </w:pPr>
+            <w:r>
+              <w:rPr>
+                <w:rFonts w:ascii="Times New Roman" w:cs="Times New Roman" w:eastAsia="Times New Roman" w:hAnsi="Times New Roman"/>
+                <w:sz w:val="19"/>
+                <w:szCs w:val="19"/>
+              </w:rPr>
+              <w:t xml:space="preserve">• Empty State empatik dengan ilustrasi maskot ramah.</w:t>
+            </w:r>
+          </w:p>
+          <w:p>
+            <w:pPr>
+              <w:spacing w:after="30" w:before="20" w:line="230"/>
+            </w:pPr>
+            <w:r>
+              <w:rPr>
+                <w:rFonts w:ascii="Times New Roman" w:cs="Times New Roman" w:eastAsia="Times New Roman" w:hAnsi="Times New Roman"/>
+                <w:sz w:val="19"/>
+                <w:szCs w:val="19"/>
+              </w:rPr>
+              <w:t xml:space="preserve">• Tombol aksi solutif: ganti tanggal atau cek rute alternatif.</w:t>
+            </w:r>
+          </w:p>
+          <w:p>
+            <w:pPr>
+              <w:spacing w:after="40" w:before="40"/>
               <w:jc w:val="center"/>
             </w:pPr>
             <w:r>
               <w:drawing>
                 <wp:inline distT="0" distB="0" distL="0" distR="0">
-                  <wp:extent cx="1905000" cy="1047750"/>
+                  <wp:extent cx="1809750" cy="1000125"/>
                   <wp:effectExtent t="0" r="0" b="0" l="0"/>
                   <wp:docPr id="1" name="" descr="" title=""/>
                   <wp:cNvGraphicFramePr>
@@ -1732,7 +2097,7 @@
                         <pic:spPr bwMode="auto">
                           <a:xfrm>
                             <a:off x="0" y="0"/>
-                            <a:ext cx="1905000" cy="1047750"/>
+                            <a:ext cx="1809750" cy="1000125"/>
                           </a:xfrm>
                           <a:prstGeom prst="rect">
                             <a:avLst/>
@@ -1748,8 +2113,16 @@
         </w:tc>
         <w:tc>
           <w:p>
-            <w:r>
-              <w:t xml:space="preserve">Help Users Recognize, Diagnose, and Recover from Errors (Nielsen #9).</w:t>
+            <w:pPr>
+              <w:spacing w:after="30" w:before="20" w:line="230"/>
+            </w:pPr>
+            <w:r>
+              <w:rPr>
+                <w:rFonts w:ascii="Times New Roman" w:cs="Times New Roman" w:eastAsia="Times New Roman" w:hAnsi="Times New Roman"/>
+                <w:sz w:val="19"/>
+                <w:szCs w:val="19"/>
+              </w:rPr>
+              <w:t xml:space="preserve">• Help Users Recognize, Diagnose, and Recover from Errors (Nielsen #9).</w:t>
             </w:r>
           </w:p>
         </w:tc>
@@ -1757,7 +2130,7 @@
     </w:tbl>
     <w:p>
       <w:pPr>
-        <w:spacing w:after="100" w:before="240"/>
+        <w:spacing w:after="80" w:before="200"/>
       </w:pPr>
     </w:p>
     <w:p>
@@ -1771,96 +2144,479 @@
           <w:b/>
           <w:bCs/>
           <w:color w:val="003C71"/>
-          <w:sz w:val="28"/>
-          <w:szCs w:val="28"/>
-        </w:rPr>
-        <w:t xml:space="preserve">5. RINGKASAN HASIL REDESAIN &amp; DAMPAK UX</w:t>
-      </w:r>
-    </w:p>
-    <w:p>
-      <w:pPr>
-        <w:spacing w:after="80" w:before="60" w:line="276"/>
+          <w:sz w:val="26"/>
+          <w:szCs w:val="26"/>
+        </w:rPr>
+        <w:t xml:space="preserve">5. FITUR REDESAIN TAMBAHAN (TANPA KOMPARASI BEFORE-AFTER)</w:t>
+      </w:r>
+    </w:p>
+    <w:p>
+      <w:pPr>
+        <w:spacing w:after="70" w:before="50" w:line="260"/>
+      </w:pPr>
+      <w:r>
+        <w:rPr>
+          <w:rFonts w:ascii="Times New Roman" w:cs="Times New Roman" w:eastAsia="Times New Roman" w:hAnsi="Times New Roman"/>
+          <w:sz w:val="21"/>
+          <w:szCs w:val="21"/>
+        </w:rPr>
+        <w:t xml:space="preserve">Bagian ini memaparkan fitur-fitur baru hasil redesain yang tidak memiliki komparasi langsung (apple-to-apple) dengan sistem eksisting (booking.kai.id). Fitur-fitur ini merupakan inovasi penemuan informasi (information search) yang sebelumnya belum ada atau masih terpisah di luar sistem reservasi utama:</w:t>
+      </w:r>
+    </w:p>
+    <w:p>
+      <w:pPr>
+        <w:pStyle w:val="Heading2"/>
+        <w:spacing w:after="80" w:before="200"/>
       </w:pPr>
       <w:r>
         <w:rPr>
           <w:rFonts w:ascii="Times New Roman" w:cs="Times New Roman" w:eastAsia="Times New Roman" w:hAnsi="Times New Roman"/>
           <w:b/>
           <w:bCs/>
-          <w:sz w:val="22"/>
-          <w:szCs w:val="22"/>
-        </w:rPr>
-        <w:t xml:space="preserve">Masalah Utama pada BEFORE:</w:t>
-      </w:r>
-    </w:p>
-    <w:p>
-      <w:pPr>
-        <w:spacing w:after="80" w:before="60" w:line="276"/>
-      </w:pPr>
-      <w:r>
-        <w:rPr>
-          <w:rFonts w:ascii="Times New Roman" w:cs="Times New Roman" w:eastAsia="Times New Roman" w:hAnsi="Times New Roman"/>
-          <w:sz w:val="22"/>
-          <w:szCs w:val="22"/>
-        </w:rPr>
-        <w:t xml:space="preserve">Sistem pencarian tiket lama pada booking.kai.id didominasi oleh formulir statis kaku yang membebankan memori pengguna (harus menghafal nama resmi stasiun), tidak memiliki bantuan konteks spasial/peta, tidak menyediakan perbandingan harga antartanggal secara simultan, serta opsi filter/sorting yang tersembunyi.</w:t>
-      </w:r>
-    </w:p>
-    <w:p>
-      <w:pPr>
-        <w:spacing w:after="80" w:before="60" w:line="276"/>
+          <w:color w:val="003C71"/>
+          <w:sz w:val="23"/>
+          <w:szCs w:val="23"/>
+        </w:rPr>
+        <w:t xml:space="preserve">5.1. Pusat Promo &amp; Voucher Terintegrasi (/promo)</w:t>
+      </w:r>
+    </w:p>
+    <w:p>
+      <w:pPr>
+        <w:spacing w:after="70" w:before="50" w:line="260"/>
+      </w:pPr>
+      <w:r>
+        <w:rPr>
+          <w:rFonts w:ascii="Times New Roman" w:cs="Times New Roman" w:eastAsia="Times New Roman" w:hAnsi="Times New Roman"/>
+          <w:sz w:val="21"/>
+          <w:szCs w:val="21"/>
+        </w:rPr>
+        <w:t xml:space="preserve">• Latar Belakang Ketiadaan Fitur: Pada sistem reservasi lama KAI, informasi promo tiket dan diskon tarif hanya dipublikasikan melalui spanduk statis di situs eksternal atau media sosial. Pengguna harus mencatat kode voucher secara manual dan sering kali lupa saat mengisi formulir pemesanan.</w:t>
+      </w:r>
+    </w:p>
+    <w:p>
+      <w:pPr>
+        <w:spacing w:after="70" w:before="50" w:line="260"/>
+      </w:pPr>
+      <w:r>
+        <w:rPr>
+          <w:rFonts w:ascii="Times New Roman" w:cs="Times New Roman" w:eastAsia="Times New Roman" w:hAnsi="Times New Roman"/>
+          <w:sz w:val="21"/>
+          <w:szCs w:val="21"/>
+        </w:rPr>
+        <w:t xml:space="preserve">• Solusi Redesain: Disediakan halaman khusus Pusat Promo (/promo) yang terintegrasi langsung dengan sistem pencarian tiket.</w:t>
+      </w:r>
+    </w:p>
+    <w:p>
+      <w:pPr>
+        <w:spacing w:after="70" w:before="50" w:line="260"/>
+      </w:pPr>
+      <w:r>
+        <w:rPr>
+          <w:rFonts w:ascii="Times New Roman" w:cs="Times New Roman" w:eastAsia="Times New Roman" w:hAnsi="Times New Roman"/>
+          <w:sz w:val="21"/>
+          <w:szCs w:val="21"/>
+        </w:rPr>
+        <w:t xml:space="preserve">• Kemampuan Penemuan Informasi:</w:t>
+      </w:r>
+    </w:p>
+    <w:p>
+      <w:pPr>
+        <w:spacing w:after="70" w:before="50" w:line="260"/>
+      </w:pPr>
+      <w:r>
+        <w:rPr>
+          <w:rFonts w:ascii="Times New Roman" w:cs="Times New Roman" w:eastAsia="Times New Roman" w:hAnsi="Times New Roman"/>
+          <w:sz w:val="21"/>
+          <w:szCs w:val="21"/>
+        </w:rPr>
+        <w:t xml:space="preserve">  - Filter Kategori Promo: Menyaring promo berdasarkan kota destinasi favorit serta periode waktu berlaku.</w:t>
+      </w:r>
+    </w:p>
+    <w:p>
+      <w:pPr>
+        <w:spacing w:after="70" w:before="50" w:line="260"/>
+      </w:pPr>
+      <w:r>
+        <w:rPr>
+          <w:rFonts w:ascii="Times New Roman" w:cs="Times New Roman" w:eastAsia="Times New Roman" w:hAnsi="Times New Roman"/>
+          <w:sz w:val="21"/>
+          <w:szCs w:val="21"/>
+        </w:rPr>
+        <w:t xml:space="preserve">  - Live Search Promo: Pencarian cepat nama event promo atau rute tujuan tertentu.</w:t>
+      </w:r>
+    </w:p>
+    <w:p>
+      <w:pPr>
+        <w:spacing w:after="70" w:before="50" w:line="260"/>
+      </w:pPr>
+      <w:r>
+        <w:rPr>
+          <w:rFonts w:ascii="Times New Roman" w:cs="Times New Roman" w:eastAsia="Times New Roman" w:hAnsi="Times New Roman"/>
+          <w:sz w:val="21"/>
+          <w:szCs w:val="21"/>
+        </w:rPr>
+        <w:t xml:space="preserve">  - Aksi 1-Klik 'Pakai Promo': Tombol pada kartu promo langsung mengarahkan pengguna ke formulir pemesanan beranda dengan rute stasiun dan kode voucher yang sudah terpasang otomatis (pre-filled), mencegah kesalahan pengetikan.</w:t>
+      </w:r>
+    </w:p>
+    <w:p>
+      <w:pPr>
+        <w:spacing w:after="70" w:before="50" w:line="260"/>
+      </w:pPr>
+      <w:r>
+        <w:rPr>
+          <w:rFonts w:ascii="Times New Roman" w:cs="Times New Roman" w:eastAsia="Times New Roman" w:hAnsi="Times New Roman"/>
+          <w:sz w:val="21"/>
+          <w:szCs w:val="21"/>
+        </w:rPr>
+        <w:t xml:space="preserve">• Prinsip IMK Terkait: Recognition rather than Recall &amp; Flexibility and Efficiency of Use.</w:t>
+      </w:r>
+    </w:p>
+    <w:p>
+      <w:pPr>
+        <w:spacing w:after="40" w:before="40"/>
+        <w:jc w:val="center"/>
+      </w:pPr>
+      <w:r>
+        <w:drawing>
+          <wp:inline distT="0" distB="0" distL="0" distR="0">
+            <wp:extent cx="4381500" cy="2286000"/>
+            <wp:effectExtent t="0" r="0" b="0" l="0"/>
+            <wp:docPr id="1" name="" descr="" title=""/>
+            <wp:cNvGraphicFramePr>
+              <a:graphicFrameLocks xmlns:a="http://schemas.openxmlformats.org/drawingml/2006/main" noChangeAspect="1"/>
+            </wp:cNvGraphicFramePr>
+            <a:graphic xmlns:a="http://schemas.openxmlformats.org/drawingml/2006/main">
+              <a:graphicData uri="http://schemas.openxmlformats.org/drawingml/2006/picture">
+                <pic:pic xmlns:pic="http://schemas.openxmlformats.org/drawingml/2006/picture">
+                  <pic:nvPicPr>
+                    <pic:cNvPr id="0" name="" descr=""/>
+                    <pic:cNvPicPr>
+                      <a:picLocks noChangeAspect="1" noChangeArrowheads="1"/>
+                    </pic:cNvPicPr>
+                  </pic:nvPicPr>
+                  <pic:blipFill>
+                    <a:blip r:embed="rId20" cstate="none"/>
+                    <a:srcRect/>
+                    <a:stretch>
+                      <a:fillRect/>
+                    </a:stretch>
+                  </pic:blipFill>
+                  <pic:spPr bwMode="auto">
+                    <a:xfrm>
+                      <a:off x="0" y="0"/>
+                      <a:ext cx="4381500" cy="2286000"/>
+                    </a:xfrm>
+                    <a:prstGeom prst="rect">
+                      <a:avLst/>
+                    </a:prstGeom>
+                  </pic:spPr>
+                </pic:pic>
+              </a:graphicData>
+            </a:graphic>
+          </wp:inline>
+        </w:drawing>
+      </w:r>
+    </w:p>
+    <w:p>
+      <w:pPr>
+        <w:spacing w:after="120" w:before="20"/>
+        <w:jc w:val="center"/>
+      </w:pPr>
+      <w:r>
+        <w:rPr>
+          <w:i/>
+          <w:iCs/>
+          <w:color w:val="555555"/>
+          <w:sz w:val="18"/>
+          <w:szCs w:val="18"/>
+        </w:rPr>
+        <w:t xml:space="preserve">Gambar 5.1 Antarmuka Pusat Promo Terintegrasi (/promo)</w:t>
+      </w:r>
+    </w:p>
+    <w:p>
+      <w:pPr>
+        <w:pStyle w:val="Heading2"/>
+        <w:spacing w:after="80" w:before="200"/>
       </w:pPr>
       <w:r>
         <w:rPr>
           <w:rFonts w:ascii="Times New Roman" w:cs="Times New Roman" w:eastAsia="Times New Roman" w:hAnsi="Times New Roman"/>
           <w:b/>
           <w:bCs/>
-          <w:sz w:val="22"/>
-          <w:szCs w:val="22"/>
-        </w:rPr>
-        <w:t xml:space="preserve">Perbaikan Utama pada AFTER:</w:t>
-      </w:r>
-    </w:p>
-    <w:p>
-      <w:pPr>
-        <w:spacing w:after="80" w:before="60" w:line="276"/>
-      </w:pPr>
-      <w:r>
-        <w:rPr>
-          <w:rFonts w:ascii="Times New Roman" w:cs="Times New Roman" w:eastAsia="Times New Roman" w:hAnsi="Times New Roman"/>
-          <w:sz w:val="22"/>
-          <w:szCs w:val="22"/>
-        </w:rPr>
-        <w:t xml:space="preserve">Redesain menghadirkan sistem penemuan informasi holistik: Smart Modal Autocomplete dengan kelompok stasiun populer, Peta Rute Interaktif Pulau Jawa yang menyala oranye mengikuti rel nyata, Date Strip Carousel untuk perbandingan tarif termurah antartanggal dalam 1 klik, Panel Filter multi-kategori terbuka, dropdown sorting fleksibel, serta Empty State empatik berilustrasi maskot KAI.</w:t>
-      </w:r>
-    </w:p>
-    <w:p>
-      <w:pPr>
-        <w:spacing w:after="80" w:before="60" w:line="276"/>
+          <w:color w:val="003C71"/>
+          <w:sz w:val="23"/>
+          <w:szCs w:val="23"/>
+        </w:rPr>
+        <w:t xml:space="preserve">5.2. Knowledge Search &amp; FAQ Mandiri Cerdas (/faq)</w:t>
+      </w:r>
+    </w:p>
+    <w:p>
+      <w:pPr>
+        <w:spacing w:after="70" w:before="50" w:line="260"/>
+      </w:pPr>
+      <w:r>
+        <w:rPr>
+          <w:rFonts w:ascii="Times New Roman" w:cs="Times New Roman" w:eastAsia="Times New Roman" w:hAnsi="Times New Roman"/>
+          <w:sz w:val="21"/>
+          <w:szCs w:val="21"/>
+        </w:rPr>
+        <w:t xml:space="preserve">• Latar Belakang Ketiadaan Fitur: Regulasi penting perjalanan (seperti batasan bagasi 20 kg, aturan pembatalan/refund 25%, reschedule, aturan tiket bayi, hingga hewan peliharaan) sebelumnya tersembunyi di dalam lembar syarat &amp; ketentuan (T&amp;C) statis yang sangat panjang tanpa sarana pencarian interaktif.</w:t>
+      </w:r>
+    </w:p>
+    <w:p>
+      <w:pPr>
+        <w:spacing w:after="70" w:before="50" w:line="260"/>
+      </w:pPr>
+      <w:r>
+        <w:rPr>
+          <w:rFonts w:ascii="Times New Roman" w:cs="Times New Roman" w:eastAsia="Times New Roman" w:hAnsi="Times New Roman"/>
+          <w:sz w:val="21"/>
+          <w:szCs w:val="21"/>
+        </w:rPr>
+        <w:t xml:space="preserve">• Solusi Redesain: Dihadirkan modul Knowledge Search mandiri pada halaman /faq untuk memudahkan penemuan informasi regulasi non-jadwal secara cepat.</w:t>
+      </w:r>
+    </w:p>
+    <w:p>
+      <w:pPr>
+        <w:spacing w:after="70" w:before="50" w:line="260"/>
+      </w:pPr>
+      <w:r>
+        <w:rPr>
+          <w:rFonts w:ascii="Times New Roman" w:cs="Times New Roman" w:eastAsia="Times New Roman" w:hAnsi="Times New Roman"/>
+          <w:sz w:val="21"/>
+          <w:szCs w:val="21"/>
+        </w:rPr>
+        <w:t xml:space="preserve">• Kemampuan Penemuan Informasi:</w:t>
+      </w:r>
+    </w:p>
+    <w:p>
+      <w:pPr>
+        <w:spacing w:after="70" w:before="50" w:line="260"/>
+      </w:pPr>
+      <w:r>
+        <w:rPr>
+          <w:rFonts w:ascii="Times New Roman" w:cs="Times New Roman" w:eastAsia="Times New Roman" w:hAnsi="Times New Roman"/>
+          <w:sz w:val="21"/>
+          <w:szCs w:val="21"/>
+        </w:rPr>
+        <w:t xml:space="preserve">  - Live Search Bar: Pengguna cukup mengetik kata kunci pertanyaan (misal: 'bagasi', 'refund', 'anak').</w:t>
+      </w:r>
+    </w:p>
+    <w:p>
+      <w:pPr>
+        <w:spacing w:after="70" w:before="50" w:line="260"/>
+      </w:pPr>
+      <w:r>
+        <w:rPr>
+          <w:rFonts w:ascii="Times New Roman" w:cs="Times New Roman" w:eastAsia="Times New Roman" w:hAnsi="Times New Roman"/>
+          <w:sz w:val="21"/>
+          <w:szCs w:val="21"/>
+        </w:rPr>
+        <w:t xml:space="preserve">  - Search Text Highlighting: Kata kunci yang cocok pada pertanyaan dan jawaban langsung disorot dengan latar belakang kuning cerah (yellow highlight), mempercepat pemindaian visual (scanning &amp; skimming).</w:t>
+      </w:r>
+    </w:p>
+    <w:p>
+      <w:pPr>
+        <w:spacing w:after="70" w:before="50" w:line="260"/>
+      </w:pPr>
+      <w:r>
+        <w:rPr>
+          <w:rFonts w:ascii="Times New Roman" w:cs="Times New Roman" w:eastAsia="Times New Roman" w:hAnsi="Times New Roman"/>
+          <w:sz w:val="21"/>
+          <w:szCs w:val="21"/>
+        </w:rPr>
+        <w:t xml:space="preserve">  - 7 Tab Kategori Tematik: Navigasi terstruktur mencakup Pemesanan, Pembatalan &amp; Refund, Reschedule, Bagasi &amp; Hewan, Pembayaran, Fasilitas Kereta, serta Akun &amp; Keamanan.</w:t>
+      </w:r>
+    </w:p>
+    <w:p>
+      <w:pPr>
+        <w:spacing w:after="70" w:before="50" w:line="260"/>
+      </w:pPr>
+      <w:r>
+        <w:rPr>
+          <w:rFonts w:ascii="Times New Roman" w:cs="Times New Roman" w:eastAsia="Times New Roman" w:hAnsi="Times New Roman"/>
+          <w:sz w:val="21"/>
+          <w:szCs w:val="21"/>
+        </w:rPr>
+        <w:t xml:space="preserve">  - Accordion Interaktif: Format tanya-jawab yang dapat dibuka-tutup menjaga antarmuka tetap bersih dan ringkas.</w:t>
+      </w:r>
+    </w:p>
+    <w:p>
+      <w:pPr>
+        <w:spacing w:after="70" w:before="50" w:line="260"/>
+      </w:pPr>
+      <w:r>
+        <w:rPr>
+          <w:rFonts w:ascii="Times New Roman" w:cs="Times New Roman" w:eastAsia="Times New Roman" w:hAnsi="Times New Roman"/>
+          <w:sz w:val="21"/>
+          <w:szCs w:val="21"/>
+        </w:rPr>
+        <w:t xml:space="preserve">• Prinsip IMK Terkait: Help and Documentation (Nielsen #10) &amp; Information Scent.</w:t>
+      </w:r>
+    </w:p>
+    <w:p>
+      <w:pPr>
+        <w:spacing w:after="40" w:before="40"/>
+        <w:jc w:val="center"/>
+      </w:pPr>
+      <w:r>
+        <w:drawing>
+          <wp:inline distT="0" distB="0" distL="0" distR="0">
+            <wp:extent cx="4381500" cy="2286000"/>
+            <wp:effectExtent t="0" r="0" b="0" l="0"/>
+            <wp:docPr id="1" name="" descr="" title=""/>
+            <wp:cNvGraphicFramePr>
+              <a:graphicFrameLocks xmlns:a="http://schemas.openxmlformats.org/drawingml/2006/main" noChangeAspect="1"/>
+            </wp:cNvGraphicFramePr>
+            <a:graphic xmlns:a="http://schemas.openxmlformats.org/drawingml/2006/main">
+              <a:graphicData uri="http://schemas.openxmlformats.org/drawingml/2006/picture">
+                <pic:pic xmlns:pic="http://schemas.openxmlformats.org/drawingml/2006/picture">
+                  <pic:nvPicPr>
+                    <pic:cNvPr id="0" name="" descr=""/>
+                    <pic:cNvPicPr>
+                      <a:picLocks noChangeAspect="1" noChangeArrowheads="1"/>
+                    </pic:cNvPicPr>
+                  </pic:nvPicPr>
+                  <pic:blipFill>
+                    <a:blip r:embed="rId21" cstate="none"/>
+                    <a:srcRect/>
+                    <a:stretch>
+                      <a:fillRect/>
+                    </a:stretch>
+                  </pic:blipFill>
+                  <pic:spPr bwMode="auto">
+                    <a:xfrm>
+                      <a:off x="0" y="0"/>
+                      <a:ext cx="4381500" cy="2286000"/>
+                    </a:xfrm>
+                    <a:prstGeom prst="rect">
+                      <a:avLst/>
+                    </a:prstGeom>
+                  </pic:spPr>
+                </pic:pic>
+              </a:graphicData>
+            </a:graphic>
+          </wp:inline>
+        </w:drawing>
+      </w:r>
+    </w:p>
+    <w:p>
+      <w:pPr>
+        <w:spacing w:after="120" w:before="20"/>
+        <w:jc w:val="center"/>
+      </w:pPr>
+      <w:r>
+        <w:rPr>
+          <w:i/>
+          <w:iCs/>
+          <w:color w:val="555555"/>
+          <w:sz w:val="18"/>
+          <w:szCs w:val="18"/>
+        </w:rPr>
+        <w:t xml:space="preserve">Gambar 5.2 Antarmuka Knowledge Search FAQ Cerdas dengan Text Highlighting (/faq)</w:t>
+      </w:r>
+    </w:p>
+    <w:p>
+      <w:pPr>
+        <w:pStyle w:val="Heading1"/>
+        <w:spacing w:after="120" w:before="280"/>
       </w:pPr>
       <w:r>
         <w:rPr>
           <w:rFonts w:ascii="Times New Roman" w:cs="Times New Roman" w:eastAsia="Times New Roman" w:hAnsi="Times New Roman"/>
           <w:b/>
           <w:bCs/>
-          <w:sz w:val="22"/>
-          <w:szCs w:val="22"/>
+          <w:color w:val="003C71"/>
+          <w:sz w:val="26"/>
+          <w:szCs w:val="26"/>
+        </w:rPr>
+        <w:t xml:space="preserve">6. RINGKASAN HASIL REDESAIN &amp; DAMPAK UX</w:t>
+      </w:r>
+    </w:p>
+    <w:p>
+      <w:pPr>
+        <w:spacing w:after="70" w:before="50" w:line="260"/>
+      </w:pPr>
+      <w:r>
+        <w:rPr>
+          <w:rFonts w:ascii="Times New Roman" w:cs="Times New Roman" w:eastAsia="Times New Roman" w:hAnsi="Times New Roman"/>
+          <w:b/>
+          <w:bCs/>
+          <w:sz w:val="21"/>
+          <w:szCs w:val="21"/>
+        </w:rPr>
+        <w:t xml:space="preserve">Masalah Utama pada Sistem Lama (BEFORE):</w:t>
+      </w:r>
+    </w:p>
+    <w:p>
+      <w:pPr>
+        <w:spacing w:after="70" w:before="50" w:line="260"/>
+      </w:pPr>
+      <w:r>
+        <w:rPr>
+          <w:rFonts w:ascii="Times New Roman" w:cs="Times New Roman" w:eastAsia="Times New Roman" w:hAnsi="Times New Roman"/>
+          <w:sz w:val="21"/>
+          <w:szCs w:val="21"/>
+        </w:rPr>
+        <w:t xml:space="preserve">Sistem pencarian tiket lama pada booking.kai.id didominasi formulir teks kaku yang membebani daya ingat pengguna (harus hafal nama stasiun), ketiadaan konteks spasial/peta, tidak ada perbandingan harga antartanggal, serta opsi filter dan pengurutan yang tersembunyi.</w:t>
+      </w:r>
+    </w:p>
+    <w:p>
+      <w:pPr>
+        <w:spacing w:after="70" w:before="50" w:line="260"/>
+      </w:pPr>
+      <w:r>
+        <w:rPr>
+          <w:rFonts w:ascii="Times New Roman" w:cs="Times New Roman" w:eastAsia="Times New Roman" w:hAnsi="Times New Roman"/>
+          <w:b/>
+          <w:bCs/>
+          <w:sz w:val="21"/>
+          <w:szCs w:val="21"/>
+        </w:rPr>
+        <w:t xml:space="preserve">Perbaikan Utama pada Sistem Baru (AFTER):</w:t>
+      </w:r>
+    </w:p>
+    <w:p>
+      <w:pPr>
+        <w:spacing w:after="70" w:before="50" w:line="260"/>
+      </w:pPr>
+      <w:r>
+        <w:rPr>
+          <w:rFonts w:ascii="Times New Roman" w:cs="Times New Roman" w:eastAsia="Times New Roman" w:hAnsi="Times New Roman"/>
+          <w:sz w:val="21"/>
+          <w:szCs w:val="21"/>
+        </w:rPr>
+        <w:t xml:space="preserve">Redesain menghadirkan sistem penemuan informasi yang utuh: Smart Modal Autocomplete dengan kelompok stasiun populer, Peta Rute Spasial Interaktif Pulau Jawa, Date Strip Carousel untuk perbandingan tarif termurah dalam 1 klik, Toolbar Filter Dropdown dan sorting terpadu di atas hasil pencarian, Empty State empatik berilustrasi maskot, serta integrasi Pusat Promo (/promo) dan Knowledge Search FAQ (/faq).</w:t>
+      </w:r>
+    </w:p>
+    <w:p>
+      <w:pPr>
+        <w:spacing w:after="70" w:before="50" w:line="260"/>
+      </w:pPr>
+      <w:r>
+        <w:rPr>
+          <w:rFonts w:ascii="Times New Roman" w:cs="Times New Roman" w:eastAsia="Times New Roman" w:hAnsi="Times New Roman"/>
+          <w:b/>
+          <w:bCs/>
+          <w:sz w:val="21"/>
+          <w:szCs w:val="21"/>
         </w:rPr>
         <w:t xml:space="preserve">Dampak terhadap Pengalaman Pengguna (UX Impact):</w:t>
       </w:r>
     </w:p>
     <w:p>
       <w:pPr>
-        <w:spacing w:after="80" w:before="60" w:line="276"/>
-      </w:pPr>
-      <w:r>
-        <w:rPr>
-          <w:rFonts w:ascii="Times New Roman" w:cs="Times New Roman" w:eastAsia="Times New Roman" w:hAnsi="Times New Roman"/>
-          <w:sz w:val="22"/>
-          <w:szCs w:val="22"/>
-        </w:rPr>
-        <w:t xml:space="preserve">• Efektivitas (Task Success Rate): Pengguna tidak lagi mengalami salah pilih stasiun berkat adanya konteks kota, lencana kode 3 huruf stasiun, dan jalur visual peta rute.
-• Efisiensi (Time-on-Task): Waktu pencarian jadwal dan tarif termurah terpangkas drastis karena pengguna dapat membandingkan tanggal di satu layar tanpa perlu mengulang kueri pencarian dari awal.
-• Kepuasan (User Satisfaction): Pengalaman interaksi menjadi menyenangkan, modern, dan bebas hambatan mental (low cognitive friction), terbukti dengan penurunan skor PSSUQ yang signifikan melampaui benchmark global.</w:t>
+        <w:spacing w:after="70" w:before="50" w:line="260"/>
+      </w:pPr>
+      <w:r>
+        <w:rPr>
+          <w:rFonts w:ascii="Times New Roman" w:cs="Times New Roman" w:eastAsia="Times New Roman" w:hAnsi="Times New Roman"/>
+          <w:sz w:val="21"/>
+          <w:szCs w:val="21"/>
+        </w:rPr>
+        <w:t xml:space="preserve">• Efektivitas (Task Success Rate): Pengguna tidak lagi salah memilih stasiun berkat adanya lencana kota, kode resmi 3 huruf, serta panduan rute visual pada peta.
+• Efisiensi (Time-on-Task): Waktu pencarian tiket termurah berkurang signifikan karena pengguna dapat membandingkan tanggal langsung pada satu layar tanpa mengulang formulir pencarian.
+• Kepuasan (User Satisfaction): Antarmuka modern, interaktif, dan responsif memberikan kenyamanan optimal dan mengurangi beban mental pengguna dalam merencanakan perjalanan.</w:t>
       </w:r>
     </w:p>
     <w:sectPr>
@@ -2053,8 +2809,8 @@
       <w:rPr>
         <w:rFonts w:ascii="Times New Roman" w:cs="Times New Roman" w:eastAsia="Times New Roman" w:hAnsi="Times New Roman"/>
         <w:color w:val="111111"/>
-        <w:sz w:val="22"/>
-        <w:szCs w:val="22"/>
+        <w:sz w:val="21"/>
+        <w:szCs w:val="21"/>
       </w:rPr>
     </w:rPrDefault>
     <w:pPrDefault/>

</xml_diff>